<commit_message>
docs: formata relatório estritamente com base no Modelo-Artigo.docx, insere autor Anderson Viana Cataldo e link do repositório GitHub
</commit_message>
<xml_diff>
--- a/Relatorio-Artigo-Ordenacao.docx
+++ b/Relatorio-Artigo-Ordenacao.docx
@@ -144,26 +144,51 @@
     </w:p>
     <w:p>
       <w:pPr>
+        <w:rPr>
+          <w:lang w:val="pt-BR"/>
+        </w:rPr>
+      </w:pPr>
+    </w:p>
+    <w:p>
+      <w:pPr>
         <w:pStyle w:val="TAMainText"/>
+        <w:ind w:firstLine="0"/>
         <w:jc w:val="center"/>
-      </w:pPr>
+        <w:rPr>
+          <w:rFonts w:ascii="Arial" w:hAnsi="Arial" w:cs="Arial"/>
+          <w:i/>
+          <w:iCs/>
+          <w:sz w:val="28"/>
+          <w:szCs w:val="28"/>
+          <w:lang w:val="pt-BR"/>
+        </w:rPr>
+        <w:spacing w:line="240" w:lineRule="auto" w:after="120"/>
+      </w:pPr>
+      <w:bookmarkStart w:id="0" w:name="Texto2"/>
+      <w:bookmarkEnd w:id="0"/>
       <w:r>
         <w:rPr>
-          <w:rFonts w:ascii="Arial" w:hAnsi="Arial"/>
+          <w:rFonts w:ascii="Arial" w:hAnsi="Arial" w:cs="Arial"/>
+          <w:sz w:val="28"/>
+          <w:szCs w:val="28"/>
           <w:b/>
-          <w:sz w:val="28"/>
-        </w:rPr>
-        <w:t>ANÁLISE DE DESEMPENHO DE ALGORITMOS DE ORDENAÇÃO EM AMBIENTES SERIAIS E CONCORRENTES/PARALELOS: UM ESTUDO COMPARATIVO EM JAVA</w:t>
+          <w:lang w:val="pt-BR"/>
+        </w:rPr>
+        <w:t xml:space="preserve">ANÁLISE DE DESEMPENHO DE ALGORITMOS DE ORDENAÇÃO EM AMBIENTES SERIAIS E CONCORRENTES/PARALELOS: UM ESTUDO COMPARATIVO EM JAVA</w:t>
       </w:r>
     </w:p>
     <w:p>
       <w:pPr>
         <w:pStyle w:val="TAMainText"/>
+        <w:ind w:firstLine="0"/>
+        <w:rPr>
+          <w:rFonts w:ascii="Arial" w:hAnsi="Arial" w:cs="Arial"/>
+          <w:i/>
+          <w:iCs/>
+          <w:lang w:val="pt-BR"/>
+        </w:rPr>
+        <w:spacing w:line="240" w:lineRule="auto" w:after="120"/>
         <w:jc w:val="left"/>
-        <w:spacing w:line="360" w:lineRule="auto" w:after="120"/>
-        <w:rPr>
-          <w:rFonts w:ascii="Arial" w:hAnsi="Arial" w:cs="Arial"/>
-        </w:rPr>
       </w:pPr>
       <w:r>
         <w:rPr>
@@ -172,62 +197,48 @@
           <w:szCs w:val="22"/>
           <w:lang w:val="pt-BR"/>
         </w:rPr>
-        <w:t xml:space="preserve">Autor 1: Anderson</w:t>
+        <w:t xml:space="preserve">Autor: Anderson Viana Cataldo</w:t>
       </w:r>
     </w:p>
     <w:p>
       <w:pPr>
         <w:pStyle w:val="TAMainText"/>
-        <w:jc w:val="left"/>
-        <w:spacing w:line="360" w:lineRule="auto" w:after="120"/>
+        <w:ind w:firstLine="0"/>
         <w:rPr>
           <w:rFonts w:ascii="Arial" w:hAnsi="Arial" w:cs="Arial"/>
-        </w:rPr>
-      </w:pPr>
-      <w:r>
+          <w:i/>
+          <w:iCs/>
+          <w:lang w:val="pt-BR"/>
+        </w:rPr>
+      </w:pPr>
+    </w:p>
+    <w:p>
+      <w:pPr>
+        <w:pStyle w:val="TAMainText"/>
+        <w:ind w:firstLine="0"/>
         <w:rPr>
           <w:rFonts w:ascii="Arial" w:hAnsi="Arial" w:cs="Arial"/>
+          <w:i/>
+          <w:iCs/>
           <w:sz w:val="22"/>
           <w:szCs w:val="22"/>
-          <w:i/>
-          <w:lang w:val="pt-BR"/>
-        </w:rPr>
-        <w:t xml:space="preserve">Curso: Ciência da Computação - Universidade de Fortaleza (UNIFOR)</w:t>
-      </w:r>
+          <w:lang w:val="pt-BR"/>
+        </w:rPr>
+      </w:pPr>
     </w:p>
     <w:p>
       <w:pPr>
-        <w:pStyle w:val="TAMainText"/>
+        <w:pStyle w:val="NormalWeb"/>
+        <w:spacing w:before="280" w:after="120" w:line="240" w:lineRule="auto"/>
         <w:jc w:val="both"/>
-        <w:spacing w:line="180" w:lineRule="auto" w:after="120"/>
+      </w:pPr>
+      <w:bookmarkStart w:id="1" w:name="Texto3"/>
+      <w:bookmarkEnd w:id="1"/>
+      <w:r>
         <w:rPr>
           <w:rFonts w:ascii="Arial" w:hAnsi="Arial" w:cs="Arial"/>
-        </w:rPr>
-      </w:pPr>
-      <w:r>
-        <w:rPr>
-          <w:rFonts w:ascii="Arial" w:hAnsi="Arial" w:cs="Arial"/>
-          <w:sz w:val="22"/>
-          <w:szCs w:val="22"/>
-          <w:lang w:val="pt-BR"/>
-        </w:rPr>
-        <w:t xml:space="preserve"/>
-      </w:r>
-    </w:p>
-    <w:p>
-      <w:pPr>
-        <w:pStyle w:val="NormalWeb"/>
-        <w:jc w:val="both"/>
-        <w:spacing w:line="360" w:lineRule="auto" w:after="120"/>
-        <w:rPr>
-          <w:rFonts w:ascii="Arial" w:hAnsi="Arial" w:cs="Arial"/>
-        </w:rPr>
-      </w:pPr>
-      <w:r>
-        <w:rPr>
-          <w:rFonts w:ascii="Arial" w:hAnsi="Arial" w:cs="Arial"/>
-          <w:sz w:val="22"/>
-          <w:szCs w:val="22"/>
+          <w:sz w:val="20"/>
+          <w:szCs w:val="20"/>
           <w:lang w:val="pt-BR"/>
         </w:rPr>
         <w:t xml:space="preserve">Palavras-chave: Computação Concorrente. Algoritmos de Ordenação. Speedup. Java Fork/Join. Desempenho.</w:t>
@@ -235,44 +246,82 @@
     </w:p>
     <w:p>
       <w:pPr>
-        <w:pStyle w:val="TAMainText"/>
-        <w:jc w:val="both"/>
-        <w:spacing w:line="180" w:lineRule="auto" w:after="120"/>
-        <w:rPr>
-          <w:rFonts w:ascii="Arial" w:hAnsi="Arial" w:cs="Arial"/>
-        </w:rPr>
-      </w:pPr>
-      <w:r>
-        <w:rPr>
-          <w:rFonts w:ascii="Arial" w:hAnsi="Arial" w:cs="Arial"/>
-          <w:sz w:val="22"/>
-          <w:szCs w:val="22"/>
-          <w:lang w:val="pt-BR"/>
-        </w:rPr>
-        <w:t xml:space="preserve"/>
-      </w:r>
+        <w:sectPr>
+          <w:pgSz w:w="11906" w:h="16838"/>
+          <w:pgMar w:top="709" w:right="1134" w:bottom="1134" w:left="1134" w:header="0" w:footer="0" w:gutter="0"/>
+          <w:cols w:space="720"/>
+          <w:formProt w:val="0"/>
+          <w:docGrid w:linePitch="360" w:charSpace="8192"/>
+        </w:sectPr>
+      </w:pPr>
     </w:p>
     <w:p>
       <w:pPr>
+        <w:pStyle w:val="BIEmailAddress"/>
+        <w:rPr>
+          <w:lang w:val="pt-BR"/>
+        </w:rPr>
+      </w:pPr>
+    </w:p>
+    <w:p>
+      <w:pPr>
         <w:pStyle w:val="Absbox"/>
+        <w:pBdr>
+          <w:top w:val="single" w:sz="4" w:space="0" w:color="000000"/>
+          <w:left w:val="single" w:sz="4" w:space="4" w:color="000000"/>
+          <w:bottom w:val="single" w:sz="4" w:space="0" w:color="000000"/>
+          <w:right w:val="single" w:sz="4" w:space="4" w:color="000000"/>
+        </w:pBdr>
+        <w:shd w:val="clear" w:color="auto" w:fill="D9D9D9" w:themeFill="background1" w:themeFillShade="D9"/>
+        <w:spacing w:after="120"/>
+        <w:ind w:left="85"/>
+        <w:jc w:val="left"/>
+        <w:rPr>
+          <w:rFonts w:ascii="Arial" w:hAnsi="Arial" w:cs="Arial"/>
+          <w:color w:val="000000" w:themeColor="text1"/>
+          <w:sz w:val="24"/>
+          <w:szCs w:val="24"/>
+          <w:lang w:val="pt-BR"/>
+        </w:rPr>
       </w:pPr>
       <w:r>
         <w:rPr>
-          <w:rFonts w:ascii="Arial"/>
-          <w:rFonts w:hAnsi="Arial"/>
-          <w:b/>
+          <w:rFonts w:ascii="Arial" w:hAnsi="Arial" w:cs="Arial"/>
+          <w:color w:val="000000" w:themeColor="text1"/>
+          <w:sz w:val="24"/>
+          <w:szCs w:val="24"/>
+          <w:lang w:val="pt-BR"/>
         </w:rPr>
         <w:t>Resumo</w:t>
       </w:r>
     </w:p>
     <w:p>
       <w:pPr>
+        <w:sectPr>
+          <w:type w:val="continuous"/>
+          <w:pgSz w:w="11906" w:h="16838"/>
+          <w:pgMar w:top="709" w:right="1134" w:bottom="1134" w:left="1134" w:header="0" w:footer="0" w:gutter="0"/>
+          <w:cols w:space="720"/>
+          <w:formProt w:val="0"/>
+          <w:docGrid w:linePitch="360" w:charSpace="8192"/>
+        </w:sectPr>
+      </w:pPr>
+    </w:p>
+    <w:p>
+      <w:pPr>
         <w:pStyle w:val="TAMainText"/>
+        <w:ind w:left="85" w:right="130" w:firstLine="0"/>
+        <w:rPr>
+          <w:rFonts w:ascii="Arial" w:eastAsia="Arial" w:hAnsi="Arial" w:cs="Arial"/>
+          <w:b/>
+          <w:bCs/>
+          <w:color w:val="FFFFFF"/>
+          <w:sz w:val="24"/>
+          <w:szCs w:val="24"/>
+          <w:lang w:val="pt-BR"/>
+        </w:rPr>
+        <w:spacing w:line="360" w:lineRule="auto" w:after="120"/>
         <w:jc w:val="both"/>
-        <w:spacing w:line="360" w:lineRule="auto" w:after="120"/>
-        <w:rPr>
-          <w:rFonts w:ascii="Arial" w:hAnsi="Arial" w:cs="Arial"/>
-        </w:rPr>
       </w:pPr>
       <w:r>
         <w:rPr>
@@ -286,44 +335,70 @@
     </w:p>
     <w:p>
       <w:pPr>
-        <w:pStyle w:val="TAMainText"/>
-        <w:jc w:val="both"/>
-        <w:spacing w:line="180" w:lineRule="auto" w:after="120"/>
-        <w:rPr>
-          <w:rFonts w:ascii="Arial" w:hAnsi="Arial" w:cs="Arial"/>
-        </w:rPr>
-      </w:pPr>
-      <w:r>
-        <w:rPr>
-          <w:rFonts w:ascii="Arial" w:hAnsi="Arial" w:cs="Arial"/>
-          <w:sz w:val="22"/>
-          <w:szCs w:val="22"/>
-          <w:lang w:val="pt-BR"/>
-        </w:rPr>
-        <w:t xml:space="preserve"/>
-      </w:r>
+        <w:sectPr>
+          <w:type w:val="continuous"/>
+          <w:pgSz w:w="11906" w:h="16838"/>
+          <w:pgMar w:top="709" w:right="1134" w:bottom="1134" w:left="1134" w:header="0" w:footer="0" w:gutter="0"/>
+          <w:cols w:space="720"/>
+          <w:formProt w:val="0"/>
+          <w:docGrid w:linePitch="360" w:charSpace="8192"/>
+        </w:sectPr>
+      </w:pPr>
     </w:p>
     <w:p>
       <w:pPr>
         <w:pStyle w:val="Absbox"/>
+        <w:pBdr>
+          <w:top w:val="single" w:sz="4" w:space="0" w:color="000000"/>
+          <w:left w:val="single" w:sz="4" w:space="4" w:color="000000"/>
+          <w:bottom w:val="single" w:sz="4" w:space="0" w:color="000000"/>
+          <w:right w:val="single" w:sz="4" w:space="4" w:color="000000"/>
+        </w:pBdr>
+        <w:shd w:val="clear" w:color="auto" w:fill="D9D9D9" w:themeFill="background1" w:themeFillShade="D9"/>
+        <w:spacing w:after="120"/>
+        <w:ind w:left="85"/>
+        <w:jc w:val="left"/>
+        <w:rPr>
+          <w:rFonts w:ascii="Arial" w:hAnsi="Arial" w:cs="Arial"/>
+          <w:color w:val="000000" w:themeColor="text1"/>
+          <w:sz w:val="24"/>
+          <w:szCs w:val="24"/>
+          <w:lang w:val="pt-BR"/>
+        </w:rPr>
       </w:pPr>
       <w:r>
         <w:rPr>
-          <w:rFonts w:ascii="Arial"/>
-          <w:rFonts w:hAnsi="Arial"/>
-          <w:b/>
+          <w:rFonts w:ascii="Arial" w:hAnsi="Arial" w:cs="Arial"/>
+          <w:color w:val="000000" w:themeColor="text1"/>
+          <w:sz w:val="24"/>
+          <w:szCs w:val="24"/>
+          <w:lang w:val="pt-BR"/>
         </w:rPr>
         <w:t>Introdução</w:t>
       </w:r>
     </w:p>
     <w:p>
       <w:pPr>
+        <w:sectPr>
+          <w:type w:val="continuous"/>
+          <w:pgSz w:w="11906" w:h="16838"/>
+          <w:pgMar w:top="709" w:right="1134" w:bottom="1134" w:left="1134" w:header="0" w:footer="0" w:gutter="0"/>
+          <w:cols w:space="720"/>
+          <w:formProt w:val="0"/>
+          <w:docGrid w:linePitch="360" w:charSpace="8192"/>
+        </w:sectPr>
+      </w:pPr>
+    </w:p>
+    <w:p>
+      <w:pPr>
         <w:pStyle w:val="TAMainText"/>
+        <w:ind w:left="86" w:right="130" w:firstLine="0"/>
+        <w:rPr>
+          <w:rFonts w:ascii="Arial" w:hAnsi="Arial" w:cs="Arial"/>
+          <w:lang w:val="pt-BR"/>
+        </w:rPr>
+        <w:spacing w:line="360" w:lineRule="auto" w:after="120"/>
         <w:jc w:val="both"/>
-        <w:spacing w:line="360" w:lineRule="auto" w:after="120"/>
-        <w:rPr>
-          <w:rFonts w:ascii="Arial" w:hAnsi="Arial" w:cs="Arial"/>
-        </w:rPr>
       </w:pPr>
       <w:r>
         <w:rPr>
@@ -338,11 +413,18 @@
     <w:p>
       <w:pPr>
         <w:pStyle w:val="TAMainText"/>
+        <w:ind w:left="85" w:right="130" w:firstLine="0"/>
+        <w:rPr>
+          <w:rFonts w:ascii="Arial" w:eastAsia="Arial" w:hAnsi="Arial" w:cs="Arial"/>
+          <w:b/>
+          <w:bCs/>
+          <w:color w:val="FFFFFF"/>
+          <w:sz w:val="24"/>
+          <w:szCs w:val="24"/>
+          <w:lang w:val="pt-BR"/>
+        </w:rPr>
+        <w:spacing w:line="360" w:lineRule="auto" w:after="120"/>
         <w:jc w:val="both"/>
-        <w:spacing w:line="360" w:lineRule="auto" w:after="120"/>
-        <w:rPr>
-          <w:rFonts w:ascii="Arial" w:hAnsi="Arial" w:cs="Arial"/>
-        </w:rPr>
       </w:pPr>
       <w:r>
         <w:rPr>
@@ -356,44 +438,72 @@
     </w:p>
     <w:p>
       <w:pPr>
-        <w:pStyle w:val="TAMainText"/>
-        <w:jc w:val="both"/>
-        <w:spacing w:line="180" w:lineRule="auto" w:after="120"/>
-        <w:rPr>
-          <w:rFonts w:ascii="Arial" w:hAnsi="Arial" w:cs="Arial"/>
-        </w:rPr>
-      </w:pPr>
-      <w:r>
-        <w:rPr>
-          <w:rFonts w:ascii="Arial" w:hAnsi="Arial" w:cs="Arial"/>
-          <w:sz w:val="22"/>
-          <w:szCs w:val="22"/>
-          <w:lang w:val="pt-BR"/>
-        </w:rPr>
-        <w:t xml:space="preserve"/>
-      </w:r>
+        <w:sectPr>
+          <w:type w:val="continuous"/>
+          <w:pgSz w:w="11906" w:h="16838"/>
+          <w:pgMar w:top="709" w:right="1134" w:bottom="1134" w:left="1134" w:header="0" w:footer="0" w:gutter="0"/>
+          <w:cols w:space="720"/>
+          <w:formProt w:val="0"/>
+          <w:docGrid w:linePitch="360" w:charSpace="8192"/>
+        </w:sectPr>
+      </w:pPr>
     </w:p>
     <w:p>
       <w:pPr>
         <w:pStyle w:val="Absbox"/>
+        <w:pBdr>
+          <w:top w:val="single" w:sz="4" w:space="0" w:color="000000"/>
+          <w:left w:val="single" w:sz="4" w:space="4" w:color="000000"/>
+          <w:bottom w:val="single" w:sz="4" w:space="0" w:color="000000"/>
+          <w:right w:val="single" w:sz="4" w:space="4" w:color="000000"/>
+        </w:pBdr>
+        <w:shd w:val="clear" w:color="auto" w:fill="D9D9D9" w:themeFill="background1" w:themeFillShade="D9"/>
+        <w:spacing w:after="120"/>
+        <w:ind w:left="85"/>
+        <w:jc w:val="left"/>
+        <w:rPr>
+          <w:rFonts w:ascii="Arial" w:hAnsi="Arial" w:cs="Arial"/>
+          <w:color w:val="000000" w:themeColor="text1"/>
+          <w:sz w:val="24"/>
+          <w:szCs w:val="24"/>
+          <w:lang w:val="pt-BR"/>
+        </w:rPr>
       </w:pPr>
       <w:r>
         <w:rPr>
-          <w:rFonts w:ascii="Arial"/>
-          <w:rFonts w:hAnsi="Arial"/>
-          <w:b/>
+          <w:rFonts w:ascii="Arial" w:hAnsi="Arial" w:cs="Arial"/>
+          <w:color w:val="000000" w:themeColor="text1"/>
+          <w:sz w:val="24"/>
+          <w:szCs w:val="24"/>
+          <w:lang w:val="pt-BR"/>
         </w:rPr>
         <w:t>Metodologia</w:t>
       </w:r>
     </w:p>
     <w:p>
       <w:pPr>
+        <w:sectPr>
+          <w:type w:val="continuous"/>
+          <w:pgSz w:w="11906" w:h="16838"/>
+          <w:pgMar w:top="709" w:right="1134" w:bottom="1134" w:left="1134" w:header="0" w:footer="0" w:gutter="0"/>
+          <w:cols w:space="720"/>
+          <w:formProt w:val="0"/>
+          <w:docGrid w:linePitch="360" w:charSpace="8192"/>
+        </w:sectPr>
+      </w:pPr>
+    </w:p>
+    <w:p>
+      <w:pPr>
         <w:pStyle w:val="TAMainText"/>
+        <w:ind w:left="86" w:right="130" w:firstLine="0"/>
+        <w:rPr>
+          <w:rFonts w:ascii="Arial" w:hAnsi="Arial" w:cs="Arial"/>
+          <w:sz w:val="22"/>
+          <w:szCs w:val="22"/>
+          <w:lang w:val="pt-BR"/>
+        </w:rPr>
+        <w:spacing w:line="360" w:lineRule="auto" w:after="120"/>
         <w:jc w:val="both"/>
-        <w:spacing w:line="360" w:lineRule="auto" w:after="120"/>
-        <w:rPr>
-          <w:rFonts w:ascii="Arial" w:hAnsi="Arial" w:cs="Arial"/>
-        </w:rPr>
       </w:pPr>
       <w:r>
         <w:rPr>
@@ -408,11 +518,18 @@
     <w:p>
       <w:pPr>
         <w:pStyle w:val="TAMainText"/>
+        <w:ind w:left="85" w:right="130" w:firstLine="0"/>
+        <w:rPr>
+          <w:rFonts w:ascii="Arial" w:eastAsia="Arial" w:hAnsi="Arial" w:cs="Arial"/>
+          <w:b/>
+          <w:bCs/>
+          <w:color w:val="FFFFFF"/>
+          <w:sz w:val="24"/>
+          <w:szCs w:val="24"/>
+          <w:lang w:val="pt-BR"/>
+        </w:rPr>
+        <w:spacing w:line="360" w:lineRule="auto" w:after="120"/>
         <w:jc w:val="both"/>
-        <w:spacing w:line="360" w:lineRule="auto" w:after="120"/>
-        <w:rPr>
-          <w:rFonts w:ascii="Arial" w:hAnsi="Arial" w:cs="Arial"/>
-        </w:rPr>
       </w:pPr>
       <w:r>
         <w:rPr>
@@ -430,11 +547,18 @@
     <w:p>
       <w:pPr>
         <w:pStyle w:val="TAMainText"/>
+        <w:ind w:left="85" w:right="130" w:firstLine="0"/>
+        <w:rPr>
+          <w:rFonts w:ascii="Arial" w:eastAsia="Arial" w:hAnsi="Arial" w:cs="Arial"/>
+          <w:b/>
+          <w:bCs/>
+          <w:color w:val="FFFFFF"/>
+          <w:sz w:val="24"/>
+          <w:szCs w:val="24"/>
+          <w:lang w:val="pt-BR"/>
+        </w:rPr>
+        <w:spacing w:line="360" w:lineRule="auto" w:after="120"/>
         <w:jc w:val="both"/>
-        <w:spacing w:line="360" w:lineRule="auto" w:after="120"/>
-        <w:rPr>
-          <w:rFonts w:ascii="Arial" w:hAnsi="Arial" w:cs="Arial"/>
-        </w:rPr>
       </w:pPr>
       <w:r>
         <w:rPr>
@@ -448,44 +572,58 @@
     </w:p>
     <w:p>
       <w:pPr>
-        <w:pStyle w:val="TAMainText"/>
-        <w:jc w:val="both"/>
-        <w:spacing w:line="180" w:lineRule="auto" w:after="120"/>
+        <w:pStyle w:val="Absbox"/>
+        <w:pBdr>
+          <w:top w:val="single" w:sz="4" w:space="0" w:color="000000"/>
+          <w:left w:val="single" w:sz="4" w:space="4" w:color="000000"/>
+          <w:bottom w:val="single" w:sz="4" w:space="0" w:color="000000"/>
+          <w:right w:val="single" w:sz="4" w:space="4" w:color="000000"/>
+        </w:pBdr>
+        <w:shd w:val="clear" w:color="auto" w:fill="D9D9D9" w:themeFill="background1" w:themeFillShade="D9"/>
+        <w:spacing w:after="120"/>
+        <w:ind w:left="85"/>
+        <w:jc w:val="left"/>
         <w:rPr>
           <w:rFonts w:ascii="Arial" w:hAnsi="Arial" w:cs="Arial"/>
+          <w:color w:val="000000" w:themeColor="text1"/>
+          <w:sz w:val="24"/>
+          <w:szCs w:val="24"/>
+          <w:lang w:val="pt-BR"/>
         </w:rPr>
       </w:pPr>
       <w:r>
         <w:rPr>
           <w:rFonts w:ascii="Arial" w:hAnsi="Arial" w:cs="Arial"/>
-          <w:sz w:val="22"/>
-          <w:szCs w:val="22"/>
-          <w:lang w:val="pt-BR"/>
-        </w:rPr>
-        <w:t xml:space="preserve"/>
-      </w:r>
-    </w:p>
-    <w:p>
-      <w:pPr>
-        <w:pStyle w:val="Absbox"/>
-      </w:pPr>
-      <w:r>
-        <w:rPr>
-          <w:rFonts w:ascii="Arial"/>
-          <w:rFonts w:hAnsi="Arial"/>
-          <w:b/>
+          <w:color w:val="000000" w:themeColor="text1"/>
+          <w:sz w:val="24"/>
+          <w:szCs w:val="24"/>
+          <w:lang w:val="pt-BR"/>
         </w:rPr>
         <w:t>Resultados e Discussão</w:t>
       </w:r>
     </w:p>
     <w:p>
       <w:pPr>
+        <w:sectPr>
+          <w:type w:val="continuous"/>
+          <w:pgSz w:w="11906" w:h="16838"/>
+          <w:pgMar w:top="709" w:right="1134" w:bottom="1134" w:left="1134" w:header="0" w:footer="0" w:gutter="0"/>
+          <w:cols w:space="720"/>
+          <w:formProt w:val="0"/>
+          <w:docGrid w:linePitch="360" w:charSpace="8192"/>
+        </w:sectPr>
+      </w:pPr>
+    </w:p>
+    <w:p>
+      <w:pPr>
         <w:pStyle w:val="TAMainText"/>
+        <w:ind w:left="86" w:right="130" w:firstLine="0"/>
+        <w:rPr>
+          <w:rFonts w:ascii="Arial" w:hAnsi="Arial" w:cs="Arial"/>
+          <w:lang w:val="pt-BR"/>
+        </w:rPr>
+        <w:spacing w:line="360" w:lineRule="auto" w:after="120"/>
         <w:jc w:val="both"/>
-        <w:spacing w:line="360" w:lineRule="auto" w:after="120"/>
-        <w:rPr>
-          <w:rFonts w:ascii="Arial" w:hAnsi="Arial" w:cs="Arial"/>
-        </w:rPr>
       </w:pPr>
       <w:r>
         <w:rPr>
@@ -504,17 +642,22 @@
         <w:jc w:val="center"/>
       </w:tblPr>
       <w:tr>
-        <w:tc>
-          <w:tcPr/>
-          <w:p>
-            <w:pPr>
-              <w:pStyle w:val="TAMainText"/>
-              <w:jc w:val="center"/>
-            </w:pPr>
-            <w:r>
-              <w:rPr>
-                <w:rFonts w:ascii="Arial" w:hAnsi="Arial"/>
-                <w:sz w:val="18"/>
+        <w:trPr/>
+        <w:tc>
+          <w:tcPr>
+            <w:shd w:val="clear" w:color="auto" w:fill="EAEAEA"/>
+          </w:tcPr>
+          <w:p>
+            <w:pPr>
+              <w:pStyle w:val="TAMainText"/>
+              <w:jc w:val="center"/>
+              <w:spacing w:after="40" w:before="40"/>
+            </w:pPr>
+            <w:r>
+              <w:rPr>
+                <w:rFonts w:ascii="Arial" w:hAnsi="Arial"/>
+                <w:sz w:val="18"/>
+                <w:szCs w:val="18"/>
                 <w:b/>
               </w:rPr>
               <w:t xml:space="preserve">Algoritmo</w:t>
@@ -522,16 +665,20 @@
           </w:p>
         </w:tc>
         <w:tc>
-          <w:tcPr/>
-          <w:p>
-            <w:pPr>
-              <w:pStyle w:val="TAMainText"/>
-              <w:jc w:val="center"/>
-            </w:pPr>
-            <w:r>
-              <w:rPr>
-                <w:rFonts w:ascii="Arial" w:hAnsi="Arial"/>
-                <w:sz w:val="18"/>
+          <w:tcPr>
+            <w:shd w:val="clear" w:color="auto" w:fill="EAEAEA"/>
+          </w:tcPr>
+          <w:p>
+            <w:pPr>
+              <w:pStyle w:val="TAMainText"/>
+              <w:jc w:val="center"/>
+              <w:spacing w:after="40" w:before="40"/>
+            </w:pPr>
+            <w:r>
+              <w:rPr>
+                <w:rFonts w:ascii="Arial" w:hAnsi="Arial"/>
+                <w:sz w:val="18"/>
+                <w:szCs w:val="18"/>
                 <w:b/>
               </w:rPr>
               <w:t xml:space="preserve">Modo / Threads</w:t>
@@ -539,16 +686,20 @@
           </w:p>
         </w:tc>
         <w:tc>
-          <w:tcPr/>
-          <w:p>
-            <w:pPr>
-              <w:pStyle w:val="TAMainText"/>
-              <w:jc w:val="center"/>
-            </w:pPr>
-            <w:r>
-              <w:rPr>
-                <w:rFonts w:ascii="Arial" w:hAnsi="Arial"/>
-                <w:sz w:val="18"/>
+          <w:tcPr>
+            <w:shd w:val="clear" w:color="auto" w:fill="EAEAEA"/>
+          </w:tcPr>
+          <w:p>
+            <w:pPr>
+              <w:pStyle w:val="TAMainText"/>
+              <w:jc w:val="center"/>
+              <w:spacing w:after="40" w:before="40"/>
+            </w:pPr>
+            <w:r>
+              <w:rPr>
+                <w:rFonts w:ascii="Arial" w:hAnsi="Arial"/>
+                <w:sz w:val="18"/>
+                <w:szCs w:val="18"/>
                 <w:b/>
               </w:rPr>
               <w:t xml:space="preserve">N=1.000 (Aleat)</w:t>
@@ -556,16 +707,20 @@
           </w:p>
         </w:tc>
         <w:tc>
-          <w:tcPr/>
-          <w:p>
-            <w:pPr>
-              <w:pStyle w:val="TAMainText"/>
-              <w:jc w:val="center"/>
-            </w:pPr>
-            <w:r>
-              <w:rPr>
-                <w:rFonts w:ascii="Arial" w:hAnsi="Arial"/>
-                <w:sz w:val="18"/>
+          <w:tcPr>
+            <w:shd w:val="clear" w:color="auto" w:fill="EAEAEA"/>
+          </w:tcPr>
+          <w:p>
+            <w:pPr>
+              <w:pStyle w:val="TAMainText"/>
+              <w:jc w:val="center"/>
+              <w:spacing w:after="40" w:before="40"/>
+            </w:pPr>
+            <w:r>
+              <w:rPr>
+                <w:rFonts w:ascii="Arial" w:hAnsi="Arial"/>
+                <w:sz w:val="18"/>
+                <w:szCs w:val="18"/>
                 <w:b/>
               </w:rPr>
               <w:t xml:space="preserve">N=10.000 (Aleat)</w:t>
@@ -573,16 +728,20 @@
           </w:p>
         </w:tc>
         <w:tc>
-          <w:tcPr/>
-          <w:p>
-            <w:pPr>
-              <w:pStyle w:val="TAMainText"/>
-              <w:jc w:val="center"/>
-            </w:pPr>
-            <w:r>
-              <w:rPr>
-                <w:rFonts w:ascii="Arial" w:hAnsi="Arial"/>
-                <w:sz w:val="18"/>
+          <w:tcPr>
+            <w:shd w:val="clear" w:color="auto" w:fill="EAEAEA"/>
+          </w:tcPr>
+          <w:p>
+            <w:pPr>
+              <w:pStyle w:val="TAMainText"/>
+              <w:jc w:val="center"/>
+              <w:spacing w:after="40" w:before="40"/>
+            </w:pPr>
+            <w:r>
+              <w:rPr>
+                <w:rFonts w:ascii="Arial" w:hAnsi="Arial"/>
+                <w:sz w:val="18"/>
+                <w:szCs w:val="18"/>
                 <w:b/>
               </w:rPr>
               <w:t xml:space="preserve">Speedup (10k)</w:t>
@@ -590,16 +749,20 @@
           </w:p>
         </w:tc>
         <w:tc>
-          <w:tcPr/>
-          <w:p>
-            <w:pPr>
-              <w:pStyle w:val="TAMainText"/>
-              <w:jc w:val="center"/>
-            </w:pPr>
-            <w:r>
-              <w:rPr>
-                <w:rFonts w:ascii="Arial" w:hAnsi="Arial"/>
-                <w:sz w:val="18"/>
+          <w:tcPr>
+            <w:shd w:val="clear" w:color="auto" w:fill="EAEAEA"/>
+          </w:tcPr>
+          <w:p>
+            <w:pPr>
+              <w:pStyle w:val="TAMainText"/>
+              <w:jc w:val="center"/>
+              <w:spacing w:after="40" w:before="40"/>
+            </w:pPr>
+            <w:r>
+              <w:rPr>
+                <w:rFonts w:ascii="Arial" w:hAnsi="Arial"/>
+                <w:sz w:val="18"/>
+                <w:szCs w:val="18"/>
                 <w:b/>
               </w:rPr>
               <w:t xml:space="preserve">N=10.000 (Inverso)</w:t>
@@ -607,16 +770,20 @@
           </w:p>
         </w:tc>
         <w:tc>
-          <w:tcPr/>
-          <w:p>
-            <w:pPr>
-              <w:pStyle w:val="TAMainText"/>
-              <w:jc w:val="center"/>
-            </w:pPr>
-            <w:r>
-              <w:rPr>
-                <w:rFonts w:ascii="Arial" w:hAnsi="Arial"/>
-                <w:sz w:val="18"/>
+          <w:tcPr>
+            <w:shd w:val="clear" w:color="auto" w:fill="EAEAEA"/>
+          </w:tcPr>
+          <w:p>
+            <w:pPr>
+              <w:pStyle w:val="TAMainText"/>
+              <w:jc w:val="center"/>
+              <w:spacing w:after="40" w:before="40"/>
+            </w:pPr>
+            <w:r>
+              <w:rPr>
+                <w:rFonts w:ascii="Arial" w:hAnsi="Arial"/>
+                <w:sz w:val="18"/>
+                <w:szCs w:val="18"/>
                 <w:b/>
               </w:rPr>
               <w:t xml:space="preserve">Speedup Inv (10k)</w:t>
@@ -625,17 +792,20 @@
         </w:tc>
       </w:tr>
       <w:tr>
-        <w:tc>
-          <w:tcPr/>
-          <w:p>
-            <w:pPr>
-              <w:pStyle w:val="TAMainText"/>
-              <w:jc w:val="center"/>
-            </w:pPr>
-            <w:r>
-              <w:rPr>
-                <w:rFonts w:ascii="Arial" w:hAnsi="Arial"/>
-                <w:sz w:val="18"/>
+        <w:trPr/>
+        <w:tc>
+          <w:tcPr/>
+          <w:p>
+            <w:pPr>
+              <w:pStyle w:val="TAMainText"/>
+              <w:jc w:val="left"/>
+              <w:spacing w:after="40" w:before="40"/>
+            </w:pPr>
+            <w:r>
+              <w:rPr>
+                <w:rFonts w:ascii="Arial" w:hAnsi="Arial"/>
+                <w:sz w:val="18"/>
+                <w:szCs w:val="18"/>
               </w:rPr>
               <w:t xml:space="preserve">Bubble Sort</w:t>
             </w:r>
@@ -647,11 +817,13 @@
             <w:pPr>
               <w:pStyle w:val="TAMainText"/>
               <w:jc w:val="center"/>
-            </w:pPr>
-            <w:r>
-              <w:rPr>
-                <w:rFonts w:ascii="Arial" w:hAnsi="Arial"/>
-                <w:sz w:val="18"/>
+              <w:spacing w:after="40" w:before="40"/>
+            </w:pPr>
+            <w:r>
+              <w:rPr>
+                <w:rFonts w:ascii="Arial" w:hAnsi="Arial"/>
+                <w:sz w:val="18"/>
+                <w:szCs w:val="18"/>
               </w:rPr>
               <w:t xml:space="preserve">Serial (1 Thread)</w:t>
             </w:r>
@@ -663,11 +835,13 @@
             <w:pPr>
               <w:pStyle w:val="TAMainText"/>
               <w:jc w:val="center"/>
-            </w:pPr>
-            <w:r>
-              <w:rPr>
-                <w:rFonts w:ascii="Arial" w:hAnsi="Arial"/>
-                <w:sz w:val="18"/>
+              <w:spacing w:after="40" w:before="40"/>
+            </w:pPr>
+            <w:r>
+              <w:rPr>
+                <w:rFonts w:ascii="Arial" w:hAnsi="Arial"/>
+                <w:sz w:val="18"/>
+                <w:szCs w:val="18"/>
               </w:rPr>
               <w:t xml:space="preserve">1,299 ms</w:t>
             </w:r>
@@ -679,11 +853,13 @@
             <w:pPr>
               <w:pStyle w:val="TAMainText"/>
               <w:jc w:val="center"/>
-            </w:pPr>
-            <w:r>
-              <w:rPr>
-                <w:rFonts w:ascii="Arial" w:hAnsi="Arial"/>
-                <w:sz w:val="18"/>
+              <w:spacing w:after="40" w:before="40"/>
+            </w:pPr>
+            <w:r>
+              <w:rPr>
+                <w:rFonts w:ascii="Arial" w:hAnsi="Arial"/>
+                <w:sz w:val="18"/>
+                <w:szCs w:val="18"/>
               </w:rPr>
               <w:t xml:space="preserve">97,510 ms</w:t>
             </w:r>
@@ -695,11 +871,13 @@
             <w:pPr>
               <w:pStyle w:val="TAMainText"/>
               <w:jc w:val="center"/>
-            </w:pPr>
-            <w:r>
-              <w:rPr>
-                <w:rFonts w:ascii="Arial" w:hAnsi="Arial"/>
-                <w:sz w:val="18"/>
+              <w:spacing w:after="40" w:before="40"/>
+            </w:pPr>
+            <w:r>
+              <w:rPr>
+                <w:rFonts w:ascii="Arial" w:hAnsi="Arial"/>
+                <w:sz w:val="18"/>
+                <w:szCs w:val="18"/>
               </w:rPr>
               <w:t xml:space="preserve">1,00x</w:t>
             </w:r>
@@ -711,11 +889,13 @@
             <w:pPr>
               <w:pStyle w:val="TAMainText"/>
               <w:jc w:val="center"/>
-            </w:pPr>
-            <w:r>
-              <w:rPr>
-                <w:rFonts w:ascii="Arial" w:hAnsi="Arial"/>
-                <w:sz w:val="18"/>
+              <w:spacing w:after="40" w:before="40"/>
+            </w:pPr>
+            <w:r>
+              <w:rPr>
+                <w:rFonts w:ascii="Arial" w:hAnsi="Arial"/>
+                <w:sz w:val="18"/>
+                <w:szCs w:val="18"/>
               </w:rPr>
               <w:t xml:space="preserve">52,525 ms</w:t>
             </w:r>
@@ -727,11 +907,13 @@
             <w:pPr>
               <w:pStyle w:val="TAMainText"/>
               <w:jc w:val="center"/>
-            </w:pPr>
-            <w:r>
-              <w:rPr>
-                <w:rFonts w:ascii="Arial" w:hAnsi="Arial"/>
-                <w:sz w:val="18"/>
+              <w:spacing w:after="40" w:before="40"/>
+            </w:pPr>
+            <w:r>
+              <w:rPr>
+                <w:rFonts w:ascii="Arial" w:hAnsi="Arial"/>
+                <w:sz w:val="18"/>
+                <w:szCs w:val="18"/>
               </w:rPr>
               <w:t xml:space="preserve">1,00x</w:t>
             </w:r>
@@ -739,17 +921,20 @@
         </w:tc>
       </w:tr>
       <w:tr>
-        <w:tc>
-          <w:tcPr/>
-          <w:p>
-            <w:pPr>
-              <w:pStyle w:val="TAMainText"/>
-              <w:jc w:val="center"/>
-            </w:pPr>
-            <w:r>
-              <w:rPr>
-                <w:rFonts w:ascii="Arial" w:hAnsi="Arial"/>
-                <w:sz w:val="18"/>
+        <w:trPr/>
+        <w:tc>
+          <w:tcPr/>
+          <w:p>
+            <w:pPr>
+              <w:pStyle w:val="TAMainText"/>
+              <w:jc w:val="left"/>
+              <w:spacing w:after="40" w:before="40"/>
+            </w:pPr>
+            <w:r>
+              <w:rPr>
+                <w:rFonts w:ascii="Arial" w:hAnsi="Arial"/>
+                <w:sz w:val="18"/>
+                <w:szCs w:val="18"/>
               </w:rPr>
               <w:t xml:space="preserve">Bubble Sort</w:t>
             </w:r>
@@ -761,11 +946,13 @@
             <w:pPr>
               <w:pStyle w:val="TAMainText"/>
               <w:jc w:val="center"/>
-            </w:pPr>
-            <w:r>
-              <w:rPr>
-                <w:rFonts w:ascii="Arial" w:hAnsi="Arial"/>
-                <w:sz w:val="18"/>
+              <w:spacing w:after="40" w:before="40"/>
+            </w:pPr>
+            <w:r>
+              <w:rPr>
+                <w:rFonts w:ascii="Arial" w:hAnsi="Arial"/>
+                <w:sz w:val="18"/>
+                <w:szCs w:val="18"/>
               </w:rPr>
               <w:t xml:space="preserve">Paralelo (2 Threads)</w:t>
             </w:r>
@@ -777,11 +964,13 @@
             <w:pPr>
               <w:pStyle w:val="TAMainText"/>
               <w:jc w:val="center"/>
-            </w:pPr>
-            <w:r>
-              <w:rPr>
-                <w:rFonts w:ascii="Arial" w:hAnsi="Arial"/>
-                <w:sz w:val="18"/>
+              <w:spacing w:after="40" w:before="40"/>
+            </w:pPr>
+            <w:r>
+              <w:rPr>
+                <w:rFonts w:ascii="Arial" w:hAnsi="Arial"/>
+                <w:sz w:val="18"/>
+                <w:szCs w:val="18"/>
               </w:rPr>
               <w:t xml:space="preserve">14,756 ms</w:t>
             </w:r>
@@ -793,11 +982,13 @@
             <w:pPr>
               <w:pStyle w:val="TAMainText"/>
               <w:jc w:val="center"/>
-            </w:pPr>
-            <w:r>
-              <w:rPr>
-                <w:rFonts w:ascii="Arial" w:hAnsi="Arial"/>
-                <w:sz w:val="18"/>
+              <w:spacing w:after="40" w:before="40"/>
+            </w:pPr>
+            <w:r>
+              <w:rPr>
+                <w:rFonts w:ascii="Arial" w:hAnsi="Arial"/>
+                <w:sz w:val="18"/>
+                <w:szCs w:val="18"/>
               </w:rPr>
               <w:t xml:space="preserve">165,114 ms</w:t>
             </w:r>
@@ -809,11 +1000,13 @@
             <w:pPr>
               <w:pStyle w:val="TAMainText"/>
               <w:jc w:val="center"/>
-            </w:pPr>
-            <w:r>
-              <w:rPr>
-                <w:rFonts w:ascii="Arial" w:hAnsi="Arial"/>
-                <w:sz w:val="18"/>
+              <w:spacing w:after="40" w:before="40"/>
+            </w:pPr>
+            <w:r>
+              <w:rPr>
+                <w:rFonts w:ascii="Arial" w:hAnsi="Arial"/>
+                <w:sz w:val="18"/>
+                <w:szCs w:val="18"/>
               </w:rPr>
               <w:t xml:space="preserve">0,59x</w:t>
             </w:r>
@@ -825,11 +1018,13 @@
             <w:pPr>
               <w:pStyle w:val="TAMainText"/>
               <w:jc w:val="center"/>
-            </w:pPr>
-            <w:r>
-              <w:rPr>
-                <w:rFonts w:ascii="Arial" w:hAnsi="Arial"/>
-                <w:sz w:val="18"/>
+              <w:spacing w:after="40" w:before="40"/>
+            </w:pPr>
+            <w:r>
+              <w:rPr>
+                <w:rFonts w:ascii="Arial" w:hAnsi="Arial"/>
+                <w:sz w:val="18"/>
+                <w:szCs w:val="18"/>
               </w:rPr>
               <w:t xml:space="preserve">162,118 ms</w:t>
             </w:r>
@@ -841,11 +1036,13 @@
             <w:pPr>
               <w:pStyle w:val="TAMainText"/>
               <w:jc w:val="center"/>
-            </w:pPr>
-            <w:r>
-              <w:rPr>
-                <w:rFonts w:ascii="Arial" w:hAnsi="Arial"/>
-                <w:sz w:val="18"/>
+              <w:spacing w:after="40" w:before="40"/>
+            </w:pPr>
+            <w:r>
+              <w:rPr>
+                <w:rFonts w:ascii="Arial" w:hAnsi="Arial"/>
+                <w:sz w:val="18"/>
+                <w:szCs w:val="18"/>
               </w:rPr>
               <w:t xml:space="preserve">0,32x</w:t>
             </w:r>
@@ -853,17 +1050,20 @@
         </w:tc>
       </w:tr>
       <w:tr>
-        <w:tc>
-          <w:tcPr/>
-          <w:p>
-            <w:pPr>
-              <w:pStyle w:val="TAMainText"/>
-              <w:jc w:val="center"/>
-            </w:pPr>
-            <w:r>
-              <w:rPr>
-                <w:rFonts w:ascii="Arial" w:hAnsi="Arial"/>
-                <w:sz w:val="18"/>
+        <w:trPr/>
+        <w:tc>
+          <w:tcPr/>
+          <w:p>
+            <w:pPr>
+              <w:pStyle w:val="TAMainText"/>
+              <w:jc w:val="left"/>
+              <w:spacing w:after="40" w:before="40"/>
+            </w:pPr>
+            <w:r>
+              <w:rPr>
+                <w:rFonts w:ascii="Arial" w:hAnsi="Arial"/>
+                <w:sz w:val="18"/>
+                <w:szCs w:val="18"/>
               </w:rPr>
               <w:t xml:space="preserve">Bubble Sort</w:t>
             </w:r>
@@ -875,11 +1075,13 @@
             <w:pPr>
               <w:pStyle w:val="TAMainText"/>
               <w:jc w:val="center"/>
-            </w:pPr>
-            <w:r>
-              <w:rPr>
-                <w:rFonts w:ascii="Arial" w:hAnsi="Arial"/>
-                <w:sz w:val="18"/>
+              <w:spacing w:after="40" w:before="40"/>
+            </w:pPr>
+            <w:r>
+              <w:rPr>
+                <w:rFonts w:ascii="Arial" w:hAnsi="Arial"/>
+                <w:sz w:val="18"/>
+                <w:szCs w:val="18"/>
               </w:rPr>
               <w:t xml:space="preserve">Paralelo (4 Threads)</w:t>
             </w:r>
@@ -891,11 +1093,13 @@
             <w:pPr>
               <w:pStyle w:val="TAMainText"/>
               <w:jc w:val="center"/>
-            </w:pPr>
-            <w:r>
-              <w:rPr>
-                <w:rFonts w:ascii="Arial" w:hAnsi="Arial"/>
-                <w:sz w:val="18"/>
+              <w:spacing w:after="40" w:before="40"/>
+            </w:pPr>
+            <w:r>
+              <w:rPr>
+                <w:rFonts w:ascii="Arial" w:hAnsi="Arial"/>
+                <w:sz w:val="18"/>
+                <w:szCs w:val="18"/>
               </w:rPr>
               <w:t xml:space="preserve">15,821 ms</w:t>
             </w:r>
@@ -907,11 +1111,13 @@
             <w:pPr>
               <w:pStyle w:val="TAMainText"/>
               <w:jc w:val="center"/>
-            </w:pPr>
-            <w:r>
-              <w:rPr>
-                <w:rFonts w:ascii="Arial" w:hAnsi="Arial"/>
-                <w:sz w:val="18"/>
+              <w:spacing w:after="40" w:before="40"/>
+            </w:pPr>
+            <w:r>
+              <w:rPr>
+                <w:rFonts w:ascii="Arial" w:hAnsi="Arial"/>
+                <w:sz w:val="18"/>
+                <w:szCs w:val="18"/>
               </w:rPr>
               <w:t xml:space="preserve">167,385 ms</w:t>
             </w:r>
@@ -923,11 +1129,13 @@
             <w:pPr>
               <w:pStyle w:val="TAMainText"/>
               <w:jc w:val="center"/>
-            </w:pPr>
-            <w:r>
-              <w:rPr>
-                <w:rFonts w:ascii="Arial" w:hAnsi="Arial"/>
-                <w:sz w:val="18"/>
+              <w:spacing w:after="40" w:before="40"/>
+            </w:pPr>
+            <w:r>
+              <w:rPr>
+                <w:rFonts w:ascii="Arial" w:hAnsi="Arial"/>
+                <w:sz w:val="18"/>
+                <w:szCs w:val="18"/>
               </w:rPr>
               <w:t xml:space="preserve">0,58x</w:t>
             </w:r>
@@ -939,11 +1147,13 @@
             <w:pPr>
               <w:pStyle w:val="TAMainText"/>
               <w:jc w:val="center"/>
-            </w:pPr>
-            <w:r>
-              <w:rPr>
-                <w:rFonts w:ascii="Arial" w:hAnsi="Arial"/>
-                <w:sz w:val="18"/>
+              <w:spacing w:after="40" w:before="40"/>
+            </w:pPr>
+            <w:r>
+              <w:rPr>
+                <w:rFonts w:ascii="Arial" w:hAnsi="Arial"/>
+                <w:sz w:val="18"/>
+                <w:szCs w:val="18"/>
               </w:rPr>
               <w:t xml:space="preserve">162,156 ms</w:t>
             </w:r>
@@ -955,11 +1165,13 @@
             <w:pPr>
               <w:pStyle w:val="TAMainText"/>
               <w:jc w:val="center"/>
-            </w:pPr>
-            <w:r>
-              <w:rPr>
-                <w:rFonts w:ascii="Arial" w:hAnsi="Arial"/>
-                <w:sz w:val="18"/>
+              <w:spacing w:after="40" w:before="40"/>
+            </w:pPr>
+            <w:r>
+              <w:rPr>
+                <w:rFonts w:ascii="Arial" w:hAnsi="Arial"/>
+                <w:sz w:val="18"/>
+                <w:szCs w:val="18"/>
               </w:rPr>
               <w:t xml:space="preserve">0,32x</w:t>
             </w:r>
@@ -967,17 +1179,20 @@
         </w:tc>
       </w:tr>
       <w:tr>
-        <w:tc>
-          <w:tcPr/>
-          <w:p>
-            <w:pPr>
-              <w:pStyle w:val="TAMainText"/>
-              <w:jc w:val="center"/>
-            </w:pPr>
-            <w:r>
-              <w:rPr>
-                <w:rFonts w:ascii="Arial" w:hAnsi="Arial"/>
-                <w:sz w:val="18"/>
+        <w:trPr/>
+        <w:tc>
+          <w:tcPr/>
+          <w:p>
+            <w:pPr>
+              <w:pStyle w:val="TAMainText"/>
+              <w:jc w:val="left"/>
+              <w:spacing w:after="40" w:before="40"/>
+            </w:pPr>
+            <w:r>
+              <w:rPr>
+                <w:rFonts w:ascii="Arial" w:hAnsi="Arial"/>
+                <w:sz w:val="18"/>
+                <w:szCs w:val="18"/>
               </w:rPr>
               <w:t xml:space="preserve">Insertion Sort</w:t>
             </w:r>
@@ -989,11 +1204,13 @@
             <w:pPr>
               <w:pStyle w:val="TAMainText"/>
               <w:jc w:val="center"/>
-            </w:pPr>
-            <w:r>
-              <w:rPr>
-                <w:rFonts w:ascii="Arial" w:hAnsi="Arial"/>
-                <w:sz w:val="18"/>
+              <w:spacing w:after="40" w:before="40"/>
+            </w:pPr>
+            <w:r>
+              <w:rPr>
+                <w:rFonts w:ascii="Arial" w:hAnsi="Arial"/>
+                <w:sz w:val="18"/>
+                <w:szCs w:val="18"/>
               </w:rPr>
               <w:t xml:space="preserve">Serial (1 Thread)</w:t>
             </w:r>
@@ -1005,11 +1222,13 @@
             <w:pPr>
               <w:pStyle w:val="TAMainText"/>
               <w:jc w:val="center"/>
-            </w:pPr>
-            <w:r>
-              <w:rPr>
-                <w:rFonts w:ascii="Arial" w:hAnsi="Arial"/>
-                <w:sz w:val="18"/>
+              <w:spacing w:after="40" w:before="40"/>
+            </w:pPr>
+            <w:r>
+              <w:rPr>
+                <w:rFonts w:ascii="Arial" w:hAnsi="Arial"/>
+                <w:sz w:val="18"/>
+                <w:szCs w:val="18"/>
               </w:rPr>
               <w:t xml:space="preserve">0,327 ms</w:t>
             </w:r>
@@ -1021,11 +1240,13 @@
             <w:pPr>
               <w:pStyle w:val="TAMainText"/>
               <w:jc w:val="center"/>
-            </w:pPr>
-            <w:r>
-              <w:rPr>
-                <w:rFonts w:ascii="Arial" w:hAnsi="Arial"/>
-                <w:sz w:val="18"/>
+              <w:spacing w:after="40" w:before="40"/>
+            </w:pPr>
+            <w:r>
+              <w:rPr>
+                <w:rFonts w:ascii="Arial" w:hAnsi="Arial"/>
+                <w:sz w:val="18"/>
+                <w:szCs w:val="18"/>
               </w:rPr>
               <w:t xml:space="preserve">29,876 ms</w:t>
             </w:r>
@@ -1037,11 +1258,13 @@
             <w:pPr>
               <w:pStyle w:val="TAMainText"/>
               <w:jc w:val="center"/>
-            </w:pPr>
-            <w:r>
-              <w:rPr>
-                <w:rFonts w:ascii="Arial" w:hAnsi="Arial"/>
-                <w:sz w:val="18"/>
+              <w:spacing w:after="40" w:before="40"/>
+            </w:pPr>
+            <w:r>
+              <w:rPr>
+                <w:rFonts w:ascii="Arial" w:hAnsi="Arial"/>
+                <w:sz w:val="18"/>
+                <w:szCs w:val="18"/>
               </w:rPr>
               <w:t xml:space="preserve">1,00x</w:t>
             </w:r>
@@ -1053,11 +1276,13 @@
             <w:pPr>
               <w:pStyle w:val="TAMainText"/>
               <w:jc w:val="center"/>
-            </w:pPr>
-            <w:r>
-              <w:rPr>
-                <w:rFonts w:ascii="Arial" w:hAnsi="Arial"/>
-                <w:sz w:val="18"/>
+              <w:spacing w:after="40" w:before="40"/>
+            </w:pPr>
+            <w:r>
+              <w:rPr>
+                <w:rFonts w:ascii="Arial" w:hAnsi="Arial"/>
+                <w:sz w:val="18"/>
+                <w:szCs w:val="18"/>
               </w:rPr>
               <w:t xml:space="preserve">56,901 ms</w:t>
             </w:r>
@@ -1069,11 +1294,13 @@
             <w:pPr>
               <w:pStyle w:val="TAMainText"/>
               <w:jc w:val="center"/>
-            </w:pPr>
-            <w:r>
-              <w:rPr>
-                <w:rFonts w:ascii="Arial" w:hAnsi="Arial"/>
-                <w:sz w:val="18"/>
+              <w:spacing w:after="40" w:before="40"/>
+            </w:pPr>
+            <w:r>
+              <w:rPr>
+                <w:rFonts w:ascii="Arial" w:hAnsi="Arial"/>
+                <w:sz w:val="18"/>
+                <w:szCs w:val="18"/>
               </w:rPr>
               <w:t xml:space="preserve">1,00x</w:t>
             </w:r>
@@ -1081,17 +1308,20 @@
         </w:tc>
       </w:tr>
       <w:tr>
-        <w:tc>
-          <w:tcPr/>
-          <w:p>
-            <w:pPr>
-              <w:pStyle w:val="TAMainText"/>
-              <w:jc w:val="center"/>
-            </w:pPr>
-            <w:r>
-              <w:rPr>
-                <w:rFonts w:ascii="Arial" w:hAnsi="Arial"/>
-                <w:sz w:val="18"/>
+        <w:trPr/>
+        <w:tc>
+          <w:tcPr/>
+          <w:p>
+            <w:pPr>
+              <w:pStyle w:val="TAMainText"/>
+              <w:jc w:val="left"/>
+              <w:spacing w:after="40" w:before="40"/>
+            </w:pPr>
+            <w:r>
+              <w:rPr>
+                <w:rFonts w:ascii="Arial" w:hAnsi="Arial"/>
+                <w:sz w:val="18"/>
+                <w:szCs w:val="18"/>
               </w:rPr>
               <w:t xml:space="preserve">Insertion Sort</w:t>
             </w:r>
@@ -1103,11 +1333,13 @@
             <w:pPr>
               <w:pStyle w:val="TAMainText"/>
               <w:jc w:val="center"/>
-            </w:pPr>
-            <w:r>
-              <w:rPr>
-                <w:rFonts w:ascii="Arial" w:hAnsi="Arial"/>
-                <w:sz w:val="18"/>
+              <w:spacing w:after="40" w:before="40"/>
+            </w:pPr>
+            <w:r>
+              <w:rPr>
+                <w:rFonts w:ascii="Arial" w:hAnsi="Arial"/>
+                <w:sz w:val="18"/>
+                <w:szCs w:val="18"/>
               </w:rPr>
               <w:t xml:space="preserve">Paralelo (2 Threads)</w:t>
             </w:r>
@@ -1119,11 +1351,13 @@
             <w:pPr>
               <w:pStyle w:val="TAMainText"/>
               <w:jc w:val="center"/>
-            </w:pPr>
-            <w:r>
-              <w:rPr>
-                <w:rFonts w:ascii="Arial" w:hAnsi="Arial"/>
-                <w:sz w:val="18"/>
+              <w:spacing w:after="40" w:before="40"/>
+            </w:pPr>
+            <w:r>
+              <w:rPr>
+                <w:rFonts w:ascii="Arial" w:hAnsi="Arial"/>
+                <w:sz w:val="18"/>
+                <w:szCs w:val="18"/>
               </w:rPr>
               <w:t xml:space="preserve">0,363 ms</w:t>
             </w:r>
@@ -1135,11 +1369,13 @@
             <w:pPr>
               <w:pStyle w:val="TAMainText"/>
               <w:jc w:val="center"/>
-            </w:pPr>
-            <w:r>
-              <w:rPr>
-                <w:rFonts w:ascii="Arial" w:hAnsi="Arial"/>
-                <w:sz w:val="18"/>
+              <w:spacing w:after="40" w:before="40"/>
+            </w:pPr>
+            <w:r>
+              <w:rPr>
+                <w:rFonts w:ascii="Arial" w:hAnsi="Arial"/>
+                <w:sz w:val="18"/>
+                <w:szCs w:val="18"/>
               </w:rPr>
               <w:t xml:space="preserve">19,317 ms</w:t>
             </w:r>
@@ -1151,11 +1387,13 @@
             <w:pPr>
               <w:pStyle w:val="TAMainText"/>
               <w:jc w:val="center"/>
-            </w:pPr>
-            <w:r>
-              <w:rPr>
-                <w:rFonts w:ascii="Arial" w:hAnsi="Arial"/>
-                <w:sz w:val="18"/>
+              <w:spacing w:after="40" w:before="40"/>
+            </w:pPr>
+            <w:r>
+              <w:rPr>
+                <w:rFonts w:ascii="Arial" w:hAnsi="Arial"/>
+                <w:sz w:val="18"/>
+                <w:szCs w:val="18"/>
               </w:rPr>
               <w:t xml:space="preserve">1,55x</w:t>
             </w:r>
@@ -1167,11 +1405,13 @@
             <w:pPr>
               <w:pStyle w:val="TAMainText"/>
               <w:jc w:val="center"/>
-            </w:pPr>
-            <w:r>
-              <w:rPr>
-                <w:rFonts w:ascii="Arial" w:hAnsi="Arial"/>
-                <w:sz w:val="18"/>
+              <w:spacing w:after="40" w:before="40"/>
+            </w:pPr>
+            <w:r>
+              <w:rPr>
+                <w:rFonts w:ascii="Arial" w:hAnsi="Arial"/>
+                <w:sz w:val="18"/>
+                <w:szCs w:val="18"/>
               </w:rPr>
               <w:t xml:space="preserve">18,653 ms</w:t>
             </w:r>
@@ -1183,11 +1423,13 @@
             <w:pPr>
               <w:pStyle w:val="TAMainText"/>
               <w:jc w:val="center"/>
-            </w:pPr>
-            <w:r>
-              <w:rPr>
-                <w:rFonts w:ascii="Arial" w:hAnsi="Arial"/>
-                <w:sz w:val="18"/>
+              <w:spacing w:after="40" w:before="40"/>
+            </w:pPr>
+            <w:r>
+              <w:rPr>
+                <w:rFonts w:ascii="Arial" w:hAnsi="Arial"/>
+                <w:sz w:val="18"/>
+                <w:szCs w:val="18"/>
               </w:rPr>
               <w:t xml:space="preserve">3,05x</w:t>
             </w:r>
@@ -1195,17 +1437,20 @@
         </w:tc>
       </w:tr>
       <w:tr>
-        <w:tc>
-          <w:tcPr/>
-          <w:p>
-            <w:pPr>
-              <w:pStyle w:val="TAMainText"/>
-              <w:jc w:val="center"/>
-            </w:pPr>
-            <w:r>
-              <w:rPr>
-                <w:rFonts w:ascii="Arial" w:hAnsi="Arial"/>
-                <w:sz w:val="18"/>
+        <w:trPr/>
+        <w:tc>
+          <w:tcPr/>
+          <w:p>
+            <w:pPr>
+              <w:pStyle w:val="TAMainText"/>
+              <w:jc w:val="left"/>
+              <w:spacing w:after="40" w:before="40"/>
+            </w:pPr>
+            <w:r>
+              <w:rPr>
+                <w:rFonts w:ascii="Arial" w:hAnsi="Arial"/>
+                <w:sz w:val="18"/>
+                <w:szCs w:val="18"/>
               </w:rPr>
               <w:t xml:space="preserve">Insertion Sort</w:t>
             </w:r>
@@ -1217,11 +1462,13 @@
             <w:pPr>
               <w:pStyle w:val="TAMainText"/>
               <w:jc w:val="center"/>
-            </w:pPr>
-            <w:r>
-              <w:rPr>
-                <w:rFonts w:ascii="Arial" w:hAnsi="Arial"/>
-                <w:sz w:val="18"/>
+              <w:spacing w:after="40" w:before="40"/>
+            </w:pPr>
+            <w:r>
+              <w:rPr>
+                <w:rFonts w:ascii="Arial" w:hAnsi="Arial"/>
+                <w:sz w:val="18"/>
+                <w:szCs w:val="18"/>
               </w:rPr>
               <w:t xml:space="preserve">Paralelo (4 Threads)</w:t>
             </w:r>
@@ -1233,11 +1480,13 @@
             <w:pPr>
               <w:pStyle w:val="TAMainText"/>
               <w:jc w:val="center"/>
-            </w:pPr>
-            <w:r>
-              <w:rPr>
-                <w:rFonts w:ascii="Arial" w:hAnsi="Arial"/>
-                <w:sz w:val="18"/>
+              <w:spacing w:after="40" w:before="40"/>
+            </w:pPr>
+            <w:r>
+              <w:rPr>
+                <w:rFonts w:ascii="Arial" w:hAnsi="Arial"/>
+                <w:sz w:val="18"/>
+                <w:szCs w:val="18"/>
               </w:rPr>
               <w:t xml:space="preserve">0,660 ms</w:t>
             </w:r>
@@ -1249,11 +1498,13 @@
             <w:pPr>
               <w:pStyle w:val="TAMainText"/>
               <w:jc w:val="center"/>
-            </w:pPr>
-            <w:r>
-              <w:rPr>
-                <w:rFonts w:ascii="Arial" w:hAnsi="Arial"/>
-                <w:sz w:val="18"/>
+              <w:spacing w:after="40" w:before="40"/>
+            </w:pPr>
+            <w:r>
+              <w:rPr>
+                <w:rFonts w:ascii="Arial" w:hAnsi="Arial"/>
+                <w:sz w:val="18"/>
+                <w:szCs w:val="18"/>
               </w:rPr>
               <w:t xml:space="preserve">3,661 ms</w:t>
             </w:r>
@@ -1265,11 +1516,13 @@
             <w:pPr>
               <w:pStyle w:val="TAMainText"/>
               <w:jc w:val="center"/>
-            </w:pPr>
-            <w:r>
-              <w:rPr>
-                <w:rFonts w:ascii="Arial" w:hAnsi="Arial"/>
-                <w:sz w:val="18"/>
+              <w:spacing w:after="40" w:before="40"/>
+            </w:pPr>
+            <w:r>
+              <w:rPr>
+                <w:rFonts w:ascii="Arial" w:hAnsi="Arial"/>
+                <w:sz w:val="18"/>
+                <w:szCs w:val="18"/>
               </w:rPr>
               <w:t xml:space="preserve">8,16x</w:t>
             </w:r>
@@ -1281,11 +1534,13 @@
             <w:pPr>
               <w:pStyle w:val="TAMainText"/>
               <w:jc w:val="center"/>
-            </w:pPr>
-            <w:r>
-              <w:rPr>
-                <w:rFonts w:ascii="Arial" w:hAnsi="Arial"/>
-                <w:sz w:val="18"/>
+              <w:spacing w:after="40" w:before="40"/>
+            </w:pPr>
+            <w:r>
+              <w:rPr>
+                <w:rFonts w:ascii="Arial" w:hAnsi="Arial"/>
+                <w:sz w:val="18"/>
+                <w:szCs w:val="18"/>
               </w:rPr>
               <w:t xml:space="preserve">6,594 ms</w:t>
             </w:r>
@@ -1297,11 +1552,13 @@
             <w:pPr>
               <w:pStyle w:val="TAMainText"/>
               <w:jc w:val="center"/>
-            </w:pPr>
-            <w:r>
-              <w:rPr>
-                <w:rFonts w:ascii="Arial" w:hAnsi="Arial"/>
-                <w:sz w:val="18"/>
+              <w:spacing w:after="40" w:before="40"/>
+            </w:pPr>
+            <w:r>
+              <w:rPr>
+                <w:rFonts w:ascii="Arial" w:hAnsi="Arial"/>
+                <w:sz w:val="18"/>
+                <w:szCs w:val="18"/>
               </w:rPr>
               <w:t xml:space="preserve">8,63x</w:t>
             </w:r>
@@ -1309,17 +1566,20 @@
         </w:tc>
       </w:tr>
       <w:tr>
-        <w:tc>
-          <w:tcPr/>
-          <w:p>
-            <w:pPr>
-              <w:pStyle w:val="TAMainText"/>
-              <w:jc w:val="center"/>
-            </w:pPr>
-            <w:r>
-              <w:rPr>
-                <w:rFonts w:ascii="Arial" w:hAnsi="Arial"/>
-                <w:sz w:val="18"/>
+        <w:trPr/>
+        <w:tc>
+          <w:tcPr/>
+          <w:p>
+            <w:pPr>
+              <w:pStyle w:val="TAMainText"/>
+              <w:jc w:val="left"/>
+              <w:spacing w:after="40" w:before="40"/>
+            </w:pPr>
+            <w:r>
+              <w:rPr>
+                <w:rFonts w:ascii="Arial" w:hAnsi="Arial"/>
+                <w:sz w:val="18"/>
+                <w:szCs w:val="18"/>
               </w:rPr>
               <w:t xml:space="preserve">Merge Sort</w:t>
             </w:r>
@@ -1331,11 +1591,13 @@
             <w:pPr>
               <w:pStyle w:val="TAMainText"/>
               <w:jc w:val="center"/>
-            </w:pPr>
-            <w:r>
-              <w:rPr>
-                <w:rFonts w:ascii="Arial" w:hAnsi="Arial"/>
-                <w:sz w:val="18"/>
+              <w:spacing w:after="40" w:before="40"/>
+            </w:pPr>
+            <w:r>
+              <w:rPr>
+                <w:rFonts w:ascii="Arial" w:hAnsi="Arial"/>
+                <w:sz w:val="18"/>
+                <w:szCs w:val="18"/>
               </w:rPr>
               <w:t xml:space="preserve">Serial (1 Thread)</w:t>
             </w:r>
@@ -1347,11 +1609,13 @@
             <w:pPr>
               <w:pStyle w:val="TAMainText"/>
               <w:jc w:val="center"/>
-            </w:pPr>
-            <w:r>
-              <w:rPr>
-                <w:rFonts w:ascii="Arial" w:hAnsi="Arial"/>
-                <w:sz w:val="18"/>
+              <w:spacing w:after="40" w:before="40"/>
+            </w:pPr>
+            <w:r>
+              <w:rPr>
+                <w:rFonts w:ascii="Arial" w:hAnsi="Arial"/>
+                <w:sz w:val="18"/>
+                <w:szCs w:val="18"/>
               </w:rPr>
               <w:t xml:space="preserve">0,146 ms</w:t>
             </w:r>
@@ -1363,11 +1627,13 @@
             <w:pPr>
               <w:pStyle w:val="TAMainText"/>
               <w:jc w:val="center"/>
-            </w:pPr>
-            <w:r>
-              <w:rPr>
-                <w:rFonts w:ascii="Arial" w:hAnsi="Arial"/>
-                <w:sz w:val="18"/>
+              <w:spacing w:after="40" w:before="40"/>
+            </w:pPr>
+            <w:r>
+              <w:rPr>
+                <w:rFonts w:ascii="Arial" w:hAnsi="Arial"/>
+                <w:sz w:val="18"/>
+                <w:szCs w:val="18"/>
               </w:rPr>
               <w:t xml:space="preserve">1,084 ms</w:t>
             </w:r>
@@ -1379,11 +1645,13 @@
             <w:pPr>
               <w:pStyle w:val="TAMainText"/>
               <w:jc w:val="center"/>
-            </w:pPr>
-            <w:r>
-              <w:rPr>
-                <w:rFonts w:ascii="Arial" w:hAnsi="Arial"/>
-                <w:sz w:val="18"/>
+              <w:spacing w:after="40" w:before="40"/>
+            </w:pPr>
+            <w:r>
+              <w:rPr>
+                <w:rFonts w:ascii="Arial" w:hAnsi="Arial"/>
+                <w:sz w:val="18"/>
+                <w:szCs w:val="18"/>
               </w:rPr>
               <w:t xml:space="preserve">1,00x</w:t>
             </w:r>
@@ -1395,11 +1663,13 @@
             <w:pPr>
               <w:pStyle w:val="TAMainText"/>
               <w:jc w:val="center"/>
-            </w:pPr>
-            <w:r>
-              <w:rPr>
-                <w:rFonts w:ascii="Arial" w:hAnsi="Arial"/>
-                <w:sz w:val="18"/>
+              <w:spacing w:after="40" w:before="40"/>
+            </w:pPr>
+            <w:r>
+              <w:rPr>
+                <w:rFonts w:ascii="Arial" w:hAnsi="Arial"/>
+                <w:sz w:val="18"/>
+                <w:szCs w:val="18"/>
               </w:rPr>
               <w:t xml:space="preserve">1,283 ms</w:t>
             </w:r>
@@ -1411,11 +1681,13 @@
             <w:pPr>
               <w:pStyle w:val="TAMainText"/>
               <w:jc w:val="center"/>
-            </w:pPr>
-            <w:r>
-              <w:rPr>
-                <w:rFonts w:ascii="Arial" w:hAnsi="Arial"/>
-                <w:sz w:val="18"/>
+              <w:spacing w:after="40" w:before="40"/>
+            </w:pPr>
+            <w:r>
+              <w:rPr>
+                <w:rFonts w:ascii="Arial" w:hAnsi="Arial"/>
+                <w:sz w:val="18"/>
+                <w:szCs w:val="18"/>
               </w:rPr>
               <w:t xml:space="preserve">1,00x</w:t>
             </w:r>
@@ -1423,17 +1695,20 @@
         </w:tc>
       </w:tr>
       <w:tr>
-        <w:tc>
-          <w:tcPr/>
-          <w:p>
-            <w:pPr>
-              <w:pStyle w:val="TAMainText"/>
-              <w:jc w:val="center"/>
-            </w:pPr>
-            <w:r>
-              <w:rPr>
-                <w:rFonts w:ascii="Arial" w:hAnsi="Arial"/>
-                <w:sz w:val="18"/>
+        <w:trPr/>
+        <w:tc>
+          <w:tcPr/>
+          <w:p>
+            <w:pPr>
+              <w:pStyle w:val="TAMainText"/>
+              <w:jc w:val="left"/>
+              <w:spacing w:after="40" w:before="40"/>
+            </w:pPr>
+            <w:r>
+              <w:rPr>
+                <w:rFonts w:ascii="Arial" w:hAnsi="Arial"/>
+                <w:sz w:val="18"/>
+                <w:szCs w:val="18"/>
               </w:rPr>
               <w:t xml:space="preserve">Merge Sort</w:t>
             </w:r>
@@ -1445,11 +1720,13 @@
             <w:pPr>
               <w:pStyle w:val="TAMainText"/>
               <w:jc w:val="center"/>
-            </w:pPr>
-            <w:r>
-              <w:rPr>
-                <w:rFonts w:ascii="Arial" w:hAnsi="Arial"/>
-                <w:sz w:val="18"/>
+              <w:spacing w:after="40" w:before="40"/>
+            </w:pPr>
+            <w:r>
+              <w:rPr>
+                <w:rFonts w:ascii="Arial" w:hAnsi="Arial"/>
+                <w:sz w:val="18"/>
+                <w:szCs w:val="18"/>
               </w:rPr>
               <w:t xml:space="preserve">Paralelo (2 Threads)</w:t>
             </w:r>
@@ -1461,11 +1738,13 @@
             <w:pPr>
               <w:pStyle w:val="TAMainText"/>
               <w:jc w:val="center"/>
-            </w:pPr>
-            <w:r>
-              <w:rPr>
-                <w:rFonts w:ascii="Arial" w:hAnsi="Arial"/>
-                <w:sz w:val="18"/>
+              <w:spacing w:after="40" w:before="40"/>
+            </w:pPr>
+            <w:r>
+              <w:rPr>
+                <w:rFonts w:ascii="Arial" w:hAnsi="Arial"/>
+                <w:sz w:val="18"/>
+                <w:szCs w:val="18"/>
               </w:rPr>
               <w:t xml:space="preserve">0,389 ms</w:t>
             </w:r>
@@ -1477,11 +1756,13 @@
             <w:pPr>
               <w:pStyle w:val="TAMainText"/>
               <w:jc w:val="center"/>
-            </w:pPr>
-            <w:r>
-              <w:rPr>
-                <w:rFonts w:ascii="Arial" w:hAnsi="Arial"/>
-                <w:sz w:val="18"/>
+              <w:spacing w:after="40" w:before="40"/>
+            </w:pPr>
+            <w:r>
+              <w:rPr>
+                <w:rFonts w:ascii="Arial" w:hAnsi="Arial"/>
+                <w:sz w:val="18"/>
+                <w:szCs w:val="18"/>
               </w:rPr>
               <w:t xml:space="preserve">0,804 ms</w:t>
             </w:r>
@@ -1493,11 +1774,13 @@
             <w:pPr>
               <w:pStyle w:val="TAMainText"/>
               <w:jc w:val="center"/>
-            </w:pPr>
-            <w:r>
-              <w:rPr>
-                <w:rFonts w:ascii="Arial" w:hAnsi="Arial"/>
-                <w:sz w:val="18"/>
+              <w:spacing w:after="40" w:before="40"/>
+            </w:pPr>
+            <w:r>
+              <w:rPr>
+                <w:rFonts w:ascii="Arial" w:hAnsi="Arial"/>
+                <w:sz w:val="18"/>
+                <w:szCs w:val="18"/>
               </w:rPr>
               <w:t xml:space="preserve">1,35x</w:t>
             </w:r>
@@ -1509,11 +1792,13 @@
             <w:pPr>
               <w:pStyle w:val="TAMainText"/>
               <w:jc w:val="center"/>
-            </w:pPr>
-            <w:r>
-              <w:rPr>
-                <w:rFonts w:ascii="Arial" w:hAnsi="Arial"/>
-                <w:sz w:val="18"/>
+              <w:spacing w:after="40" w:before="40"/>
+            </w:pPr>
+            <w:r>
+              <w:rPr>
+                <w:rFonts w:ascii="Arial" w:hAnsi="Arial"/>
+                <w:sz w:val="18"/>
+                <w:szCs w:val="18"/>
               </w:rPr>
               <w:t xml:space="preserve">0,766 ms</w:t>
             </w:r>
@@ -1525,11 +1810,13 @@
             <w:pPr>
               <w:pStyle w:val="TAMainText"/>
               <w:jc w:val="center"/>
-            </w:pPr>
-            <w:r>
-              <w:rPr>
-                <w:rFonts w:ascii="Arial" w:hAnsi="Arial"/>
-                <w:sz w:val="18"/>
+              <w:spacing w:after="40" w:before="40"/>
+            </w:pPr>
+            <w:r>
+              <w:rPr>
+                <w:rFonts w:ascii="Arial" w:hAnsi="Arial"/>
+                <w:sz w:val="18"/>
+                <w:szCs w:val="18"/>
               </w:rPr>
               <w:t xml:space="preserve">1,68x</w:t>
             </w:r>
@@ -1537,17 +1824,20 @@
         </w:tc>
       </w:tr>
       <w:tr>
-        <w:tc>
-          <w:tcPr/>
-          <w:p>
-            <w:pPr>
-              <w:pStyle w:val="TAMainText"/>
-              <w:jc w:val="center"/>
-            </w:pPr>
-            <w:r>
-              <w:rPr>
-                <w:rFonts w:ascii="Arial" w:hAnsi="Arial"/>
-                <w:sz w:val="18"/>
+        <w:trPr/>
+        <w:tc>
+          <w:tcPr/>
+          <w:p>
+            <w:pPr>
+              <w:pStyle w:val="TAMainText"/>
+              <w:jc w:val="left"/>
+              <w:spacing w:after="40" w:before="40"/>
+            </w:pPr>
+            <w:r>
+              <w:rPr>
+                <w:rFonts w:ascii="Arial" w:hAnsi="Arial"/>
+                <w:sz w:val="18"/>
+                <w:szCs w:val="18"/>
               </w:rPr>
               <w:t xml:space="preserve">Merge Sort</w:t>
             </w:r>
@@ -1559,11 +1849,13 @@
             <w:pPr>
               <w:pStyle w:val="TAMainText"/>
               <w:jc w:val="center"/>
-            </w:pPr>
-            <w:r>
-              <w:rPr>
-                <w:rFonts w:ascii="Arial" w:hAnsi="Arial"/>
-                <w:sz w:val="18"/>
+              <w:spacing w:after="40" w:before="40"/>
+            </w:pPr>
+            <w:r>
+              <w:rPr>
+                <w:rFonts w:ascii="Arial" w:hAnsi="Arial"/>
+                <w:sz w:val="18"/>
+                <w:szCs w:val="18"/>
               </w:rPr>
               <w:t xml:space="preserve">Paralelo (4 Threads)</w:t>
             </w:r>
@@ -1575,11 +1867,13 @@
             <w:pPr>
               <w:pStyle w:val="TAMainText"/>
               <w:jc w:val="center"/>
-            </w:pPr>
-            <w:r>
-              <w:rPr>
-                <w:rFonts w:ascii="Arial" w:hAnsi="Arial"/>
-                <w:sz w:val="18"/>
+              <w:spacing w:after="40" w:before="40"/>
+            </w:pPr>
+            <w:r>
+              <w:rPr>
+                <w:rFonts w:ascii="Arial" w:hAnsi="Arial"/>
+                <w:sz w:val="18"/>
+                <w:szCs w:val="18"/>
               </w:rPr>
               <w:t xml:space="preserve">0,265 ms</w:t>
             </w:r>
@@ -1591,11 +1885,13 @@
             <w:pPr>
               <w:pStyle w:val="TAMainText"/>
               <w:jc w:val="center"/>
-            </w:pPr>
-            <w:r>
-              <w:rPr>
-                <w:rFonts w:ascii="Arial" w:hAnsi="Arial"/>
-                <w:sz w:val="18"/>
+              <w:spacing w:after="40" w:before="40"/>
+            </w:pPr>
+            <w:r>
+              <w:rPr>
+                <w:rFonts w:ascii="Arial" w:hAnsi="Arial"/>
+                <w:sz w:val="18"/>
+                <w:szCs w:val="18"/>
               </w:rPr>
               <w:t xml:space="preserve">0,871 ms</w:t>
             </w:r>
@@ -1607,11 +1903,13 @@
             <w:pPr>
               <w:pStyle w:val="TAMainText"/>
               <w:jc w:val="center"/>
-            </w:pPr>
-            <w:r>
-              <w:rPr>
-                <w:rFonts w:ascii="Arial" w:hAnsi="Arial"/>
-                <w:sz w:val="18"/>
+              <w:spacing w:after="40" w:before="40"/>
+            </w:pPr>
+            <w:r>
+              <w:rPr>
+                <w:rFonts w:ascii="Arial" w:hAnsi="Arial"/>
+                <w:sz w:val="18"/>
+                <w:szCs w:val="18"/>
               </w:rPr>
               <w:t xml:space="preserve">1,25x</w:t>
             </w:r>
@@ -1623,11 +1921,13 @@
             <w:pPr>
               <w:pStyle w:val="TAMainText"/>
               <w:jc w:val="center"/>
-            </w:pPr>
-            <w:r>
-              <w:rPr>
-                <w:rFonts w:ascii="Arial" w:hAnsi="Arial"/>
-                <w:sz w:val="18"/>
+              <w:spacing w:after="40" w:before="40"/>
+            </w:pPr>
+            <w:r>
+              <w:rPr>
+                <w:rFonts w:ascii="Arial" w:hAnsi="Arial"/>
+                <w:sz w:val="18"/>
+                <w:szCs w:val="18"/>
               </w:rPr>
               <w:t xml:space="preserve">0,548 ms</w:t>
             </w:r>
@@ -1639,11 +1939,13 @@
             <w:pPr>
               <w:pStyle w:val="TAMainText"/>
               <w:jc w:val="center"/>
-            </w:pPr>
-            <w:r>
-              <w:rPr>
-                <w:rFonts w:ascii="Arial" w:hAnsi="Arial"/>
-                <w:sz w:val="18"/>
+              <w:spacing w:after="40" w:before="40"/>
+            </w:pPr>
+            <w:r>
+              <w:rPr>
+                <w:rFonts w:ascii="Arial" w:hAnsi="Arial"/>
+                <w:sz w:val="18"/>
+                <w:szCs w:val="18"/>
               </w:rPr>
               <w:t xml:space="preserve">2,34x</w:t>
             </w:r>
@@ -1651,17 +1953,20 @@
         </w:tc>
       </w:tr>
       <w:tr>
-        <w:tc>
-          <w:tcPr/>
-          <w:p>
-            <w:pPr>
-              <w:pStyle w:val="TAMainText"/>
-              <w:jc w:val="center"/>
-            </w:pPr>
-            <w:r>
-              <w:rPr>
-                <w:rFonts w:ascii="Arial" w:hAnsi="Arial"/>
-                <w:sz w:val="18"/>
+        <w:trPr/>
+        <w:tc>
+          <w:tcPr/>
+          <w:p>
+            <w:pPr>
+              <w:pStyle w:val="TAMainText"/>
+              <w:jc w:val="left"/>
+              <w:spacing w:after="40" w:before="40"/>
+            </w:pPr>
+            <w:r>
+              <w:rPr>
+                <w:rFonts w:ascii="Arial" w:hAnsi="Arial"/>
+                <w:sz w:val="18"/>
+                <w:szCs w:val="18"/>
               </w:rPr>
               <w:t xml:space="preserve">Quick Sort</w:t>
             </w:r>
@@ -1673,11 +1978,13 @@
             <w:pPr>
               <w:pStyle w:val="TAMainText"/>
               <w:jc w:val="center"/>
-            </w:pPr>
-            <w:r>
-              <w:rPr>
-                <w:rFonts w:ascii="Arial" w:hAnsi="Arial"/>
-                <w:sz w:val="18"/>
+              <w:spacing w:after="40" w:before="40"/>
+            </w:pPr>
+            <w:r>
+              <w:rPr>
+                <w:rFonts w:ascii="Arial" w:hAnsi="Arial"/>
+                <w:sz w:val="18"/>
+                <w:szCs w:val="18"/>
               </w:rPr>
               <w:t xml:space="preserve">Serial (1 Thread)</w:t>
             </w:r>
@@ -1689,11 +1996,13 @@
             <w:pPr>
               <w:pStyle w:val="TAMainText"/>
               <w:jc w:val="center"/>
-            </w:pPr>
-            <w:r>
-              <w:rPr>
-                <w:rFonts w:ascii="Arial" w:hAnsi="Arial"/>
-                <w:sz w:val="18"/>
+              <w:spacing w:after="40" w:before="40"/>
+            </w:pPr>
+            <w:r>
+              <w:rPr>
+                <w:rFonts w:ascii="Arial" w:hAnsi="Arial"/>
+                <w:sz w:val="18"/>
+                <w:szCs w:val="18"/>
               </w:rPr>
               <w:t xml:space="preserve">0,096 ms</w:t>
             </w:r>
@@ -1705,11 +2014,13 @@
             <w:pPr>
               <w:pStyle w:val="TAMainText"/>
               <w:jc w:val="center"/>
-            </w:pPr>
-            <w:r>
-              <w:rPr>
-                <w:rFonts w:ascii="Arial" w:hAnsi="Arial"/>
-                <w:sz w:val="18"/>
+              <w:spacing w:after="40" w:before="40"/>
+            </w:pPr>
+            <w:r>
+              <w:rPr>
+                <w:rFonts w:ascii="Arial" w:hAnsi="Arial"/>
+                <w:sz w:val="18"/>
+                <w:szCs w:val="18"/>
               </w:rPr>
               <w:t xml:space="preserve">1,135 ms</w:t>
             </w:r>
@@ -1721,11 +2032,13 @@
             <w:pPr>
               <w:pStyle w:val="TAMainText"/>
               <w:jc w:val="center"/>
-            </w:pPr>
-            <w:r>
-              <w:rPr>
-                <w:rFonts w:ascii="Arial" w:hAnsi="Arial"/>
-                <w:sz w:val="18"/>
+              <w:spacing w:after="40" w:before="40"/>
+            </w:pPr>
+            <w:r>
+              <w:rPr>
+                <w:rFonts w:ascii="Arial" w:hAnsi="Arial"/>
+                <w:sz w:val="18"/>
+                <w:szCs w:val="18"/>
               </w:rPr>
               <w:t xml:space="preserve">1,00x</w:t>
             </w:r>
@@ -1737,11 +2050,13 @@
             <w:pPr>
               <w:pStyle w:val="TAMainText"/>
               <w:jc w:val="center"/>
-            </w:pPr>
-            <w:r>
-              <w:rPr>
-                <w:rFonts w:ascii="Arial" w:hAnsi="Arial"/>
-                <w:sz w:val="18"/>
+              <w:spacing w:after="40" w:before="40"/>
+            </w:pPr>
+            <w:r>
+              <w:rPr>
+                <w:rFonts w:ascii="Arial" w:hAnsi="Arial"/>
+                <w:sz w:val="18"/>
+                <w:szCs w:val="18"/>
               </w:rPr>
               <w:t xml:space="preserve">0,153 ms</w:t>
             </w:r>
@@ -1753,11 +2068,13 @@
             <w:pPr>
               <w:pStyle w:val="TAMainText"/>
               <w:jc w:val="center"/>
-            </w:pPr>
-            <w:r>
-              <w:rPr>
-                <w:rFonts w:ascii="Arial" w:hAnsi="Arial"/>
-                <w:sz w:val="18"/>
+              <w:spacing w:after="40" w:before="40"/>
+            </w:pPr>
+            <w:r>
+              <w:rPr>
+                <w:rFonts w:ascii="Arial" w:hAnsi="Arial"/>
+                <w:sz w:val="18"/>
+                <w:szCs w:val="18"/>
               </w:rPr>
               <w:t xml:space="preserve">1,00x</w:t>
             </w:r>
@@ -1765,17 +2082,20 @@
         </w:tc>
       </w:tr>
       <w:tr>
-        <w:tc>
-          <w:tcPr/>
-          <w:p>
-            <w:pPr>
-              <w:pStyle w:val="TAMainText"/>
-              <w:jc w:val="center"/>
-            </w:pPr>
-            <w:r>
-              <w:rPr>
-                <w:rFonts w:ascii="Arial" w:hAnsi="Arial"/>
-                <w:sz w:val="18"/>
+        <w:trPr/>
+        <w:tc>
+          <w:tcPr/>
+          <w:p>
+            <w:pPr>
+              <w:pStyle w:val="TAMainText"/>
+              <w:jc w:val="left"/>
+              <w:spacing w:after="40" w:before="40"/>
+            </w:pPr>
+            <w:r>
+              <w:rPr>
+                <w:rFonts w:ascii="Arial" w:hAnsi="Arial"/>
+                <w:sz w:val="18"/>
+                <w:szCs w:val="18"/>
               </w:rPr>
               <w:t xml:space="preserve">Quick Sort</w:t>
             </w:r>
@@ -1787,11 +2107,13 @@
             <w:pPr>
               <w:pStyle w:val="TAMainText"/>
               <w:jc w:val="center"/>
-            </w:pPr>
-            <w:r>
-              <w:rPr>
-                <w:rFonts w:ascii="Arial" w:hAnsi="Arial"/>
-                <w:sz w:val="18"/>
+              <w:spacing w:after="40" w:before="40"/>
+            </w:pPr>
+            <w:r>
+              <w:rPr>
+                <w:rFonts w:ascii="Arial" w:hAnsi="Arial"/>
+                <w:sz w:val="18"/>
+                <w:szCs w:val="18"/>
               </w:rPr>
               <w:t xml:space="preserve">Paralelo (2 Threads)</w:t>
             </w:r>
@@ -1803,11 +2125,13 @@
             <w:pPr>
               <w:pStyle w:val="TAMainText"/>
               <w:jc w:val="center"/>
-            </w:pPr>
-            <w:r>
-              <w:rPr>
-                <w:rFonts w:ascii="Arial" w:hAnsi="Arial"/>
-                <w:sz w:val="18"/>
+              <w:spacing w:after="40" w:before="40"/>
+            </w:pPr>
+            <w:r>
+              <w:rPr>
+                <w:rFonts w:ascii="Arial" w:hAnsi="Arial"/>
+                <w:sz w:val="18"/>
+                <w:szCs w:val="18"/>
               </w:rPr>
               <w:t xml:space="preserve">0,251 ms</w:t>
             </w:r>
@@ -1819,11 +2143,13 @@
             <w:pPr>
               <w:pStyle w:val="TAMainText"/>
               <w:jc w:val="center"/>
-            </w:pPr>
-            <w:r>
-              <w:rPr>
-                <w:rFonts w:ascii="Arial" w:hAnsi="Arial"/>
-                <w:sz w:val="18"/>
+              <w:spacing w:after="40" w:before="40"/>
+            </w:pPr>
+            <w:r>
+              <w:rPr>
+                <w:rFonts w:ascii="Arial" w:hAnsi="Arial"/>
+                <w:sz w:val="18"/>
+                <w:szCs w:val="18"/>
               </w:rPr>
               <w:t xml:space="preserve">0,776 ms</w:t>
             </w:r>
@@ -1835,11 +2161,13 @@
             <w:pPr>
               <w:pStyle w:val="TAMainText"/>
               <w:jc w:val="center"/>
-            </w:pPr>
-            <w:r>
-              <w:rPr>
-                <w:rFonts w:ascii="Arial" w:hAnsi="Arial"/>
-                <w:sz w:val="18"/>
+              <w:spacing w:after="40" w:before="40"/>
+            </w:pPr>
+            <w:r>
+              <w:rPr>
+                <w:rFonts w:ascii="Arial" w:hAnsi="Arial"/>
+                <w:sz w:val="18"/>
+                <w:szCs w:val="18"/>
               </w:rPr>
               <w:t xml:space="preserve">1,46x</w:t>
             </w:r>
@@ -1851,11 +2179,13 @@
             <w:pPr>
               <w:pStyle w:val="TAMainText"/>
               <w:jc w:val="center"/>
-            </w:pPr>
-            <w:r>
-              <w:rPr>
-                <w:rFonts w:ascii="Arial" w:hAnsi="Arial"/>
-                <w:sz w:val="18"/>
+              <w:spacing w:after="40" w:before="40"/>
+            </w:pPr>
+            <w:r>
+              <w:rPr>
+                <w:rFonts w:ascii="Arial" w:hAnsi="Arial"/>
+                <w:sz w:val="18"/>
+                <w:szCs w:val="18"/>
               </w:rPr>
               <w:t xml:space="preserve">0,316 ms</w:t>
             </w:r>
@@ -1867,11 +2197,13 @@
             <w:pPr>
               <w:pStyle w:val="TAMainText"/>
               <w:jc w:val="center"/>
-            </w:pPr>
-            <w:r>
-              <w:rPr>
-                <w:rFonts w:ascii="Arial" w:hAnsi="Arial"/>
-                <w:sz w:val="18"/>
+              <w:spacing w:after="40" w:before="40"/>
+            </w:pPr>
+            <w:r>
+              <w:rPr>
+                <w:rFonts w:ascii="Arial" w:hAnsi="Arial"/>
+                <w:sz w:val="18"/>
+                <w:szCs w:val="18"/>
               </w:rPr>
               <w:t xml:space="preserve">0,48x</w:t>
             </w:r>
@@ -1879,17 +2211,20 @@
         </w:tc>
       </w:tr>
       <w:tr>
-        <w:tc>
-          <w:tcPr/>
-          <w:p>
-            <w:pPr>
-              <w:pStyle w:val="TAMainText"/>
-              <w:jc w:val="center"/>
-            </w:pPr>
-            <w:r>
-              <w:rPr>
-                <w:rFonts w:ascii="Arial" w:hAnsi="Arial"/>
-                <w:sz w:val="18"/>
+        <w:trPr/>
+        <w:tc>
+          <w:tcPr/>
+          <w:p>
+            <w:pPr>
+              <w:pStyle w:val="TAMainText"/>
+              <w:jc w:val="left"/>
+              <w:spacing w:after="40" w:before="40"/>
+            </w:pPr>
+            <w:r>
+              <w:rPr>
+                <w:rFonts w:ascii="Arial" w:hAnsi="Arial"/>
+                <w:sz w:val="18"/>
+                <w:szCs w:val="18"/>
               </w:rPr>
               <w:t xml:space="preserve">Quick Sort</w:t>
             </w:r>
@@ -1901,11 +2236,13 @@
             <w:pPr>
               <w:pStyle w:val="TAMainText"/>
               <w:jc w:val="center"/>
-            </w:pPr>
-            <w:r>
-              <w:rPr>
-                <w:rFonts w:ascii="Arial" w:hAnsi="Arial"/>
-                <w:sz w:val="18"/>
+              <w:spacing w:after="40" w:before="40"/>
+            </w:pPr>
+            <w:r>
+              <w:rPr>
+                <w:rFonts w:ascii="Arial" w:hAnsi="Arial"/>
+                <w:sz w:val="18"/>
+                <w:szCs w:val="18"/>
               </w:rPr>
               <w:t xml:space="preserve">Paralelo (4 Threads)</w:t>
             </w:r>
@@ -1917,11 +2254,13 @@
             <w:pPr>
               <w:pStyle w:val="TAMainText"/>
               <w:jc w:val="center"/>
-            </w:pPr>
-            <w:r>
-              <w:rPr>
-                <w:rFonts w:ascii="Arial" w:hAnsi="Arial"/>
-                <w:sz w:val="18"/>
+              <w:spacing w:after="40" w:before="40"/>
+            </w:pPr>
+            <w:r>
+              <w:rPr>
+                <w:rFonts w:ascii="Arial" w:hAnsi="Arial"/>
+                <w:sz w:val="18"/>
+                <w:szCs w:val="18"/>
               </w:rPr>
               <w:t xml:space="preserve">0,189 ms</w:t>
             </w:r>
@@ -1933,11 +2272,13 @@
             <w:pPr>
               <w:pStyle w:val="TAMainText"/>
               <w:jc w:val="center"/>
-            </w:pPr>
-            <w:r>
-              <w:rPr>
-                <w:rFonts w:ascii="Arial" w:hAnsi="Arial"/>
-                <w:sz w:val="18"/>
+              <w:spacing w:after="40" w:before="40"/>
+            </w:pPr>
+            <w:r>
+              <w:rPr>
+                <w:rFonts w:ascii="Arial" w:hAnsi="Arial"/>
+                <w:sz w:val="18"/>
+                <w:szCs w:val="18"/>
               </w:rPr>
               <w:t xml:space="preserve">0,815 ms</w:t>
             </w:r>
@@ -1949,11 +2290,13 @@
             <w:pPr>
               <w:pStyle w:val="TAMainText"/>
               <w:jc w:val="center"/>
-            </w:pPr>
-            <w:r>
-              <w:rPr>
-                <w:rFonts w:ascii="Arial" w:hAnsi="Arial"/>
-                <w:sz w:val="18"/>
+              <w:spacing w:after="40" w:before="40"/>
+            </w:pPr>
+            <w:r>
+              <w:rPr>
+                <w:rFonts w:ascii="Arial" w:hAnsi="Arial"/>
+                <w:sz w:val="18"/>
+                <w:szCs w:val="18"/>
               </w:rPr>
               <w:t xml:space="preserve">1,39x</w:t>
             </w:r>
@@ -1965,11 +2308,13 @@
             <w:pPr>
               <w:pStyle w:val="TAMainText"/>
               <w:jc w:val="center"/>
-            </w:pPr>
-            <w:r>
-              <w:rPr>
-                <w:rFonts w:ascii="Arial" w:hAnsi="Arial"/>
-                <w:sz w:val="18"/>
+              <w:spacing w:after="40" w:before="40"/>
+            </w:pPr>
+            <w:r>
+              <w:rPr>
+                <w:rFonts w:ascii="Arial" w:hAnsi="Arial"/>
+                <w:sz w:val="18"/>
+                <w:szCs w:val="18"/>
               </w:rPr>
               <w:t xml:space="preserve">0,399 ms</w:t>
             </w:r>
@@ -1981,11 +2326,13 @@
             <w:pPr>
               <w:pStyle w:val="TAMainText"/>
               <w:jc w:val="center"/>
-            </w:pPr>
-            <w:r>
-              <w:rPr>
-                <w:rFonts w:ascii="Arial" w:hAnsi="Arial"/>
-                <w:sz w:val="18"/>
+              <w:spacing w:after="40" w:before="40"/>
+            </w:pPr>
+            <w:r>
+              <w:rPr>
+                <w:rFonts w:ascii="Arial" w:hAnsi="Arial"/>
+                <w:sz w:val="18"/>
+                <w:szCs w:val="18"/>
               </w:rPr>
               <w:t xml:space="preserve">0,38x</w:t>
             </w:r>
@@ -1996,17 +2343,24 @@
     <w:p>
       <w:pPr>
         <w:pStyle w:val="TAMainText"/>
+        <w:ind w:left="85" w:right="130" w:firstLine="0"/>
+        <w:rPr>
+          <w:rFonts w:ascii="Arial" w:eastAsia="Arial" w:hAnsi="Arial" w:cs="Arial"/>
+          <w:b/>
+          <w:bCs/>
+          <w:color w:val="FFFFFF"/>
+          <w:sz w:val="24"/>
+          <w:szCs w:val="24"/>
+          <w:lang w:val="pt-BR"/>
+        </w:rPr>
+        <w:spacing w:line="360" w:lineRule="auto" w:after="120"/>
         <w:jc w:val="center"/>
-        <w:spacing w:line="360" w:lineRule="auto" w:after="120"/>
+      </w:pPr>
+      <w:r>
         <w:rPr>
           <w:rFonts w:ascii="Arial" w:hAnsi="Arial" w:cs="Arial"/>
-        </w:rPr>
-      </w:pPr>
-      <w:r>
-        <w:rPr>
-          <w:rFonts w:ascii="Arial" w:hAnsi="Arial" w:cs="Arial"/>
-          <w:sz w:val="22"/>
-          <w:szCs w:val="22"/>
+          <w:sz w:val="18"/>
+          <w:szCs w:val="18"/>
           <w:i/>
           <w:lang w:val="pt-BR"/>
         </w:rPr>
@@ -2016,30 +2370,18 @@
     <w:p>
       <w:pPr>
         <w:pStyle w:val="TAMainText"/>
+        <w:ind w:left="85" w:right="130" w:firstLine="0"/>
+        <w:rPr>
+          <w:rFonts w:ascii="Arial" w:eastAsia="Arial" w:hAnsi="Arial" w:cs="Arial"/>
+          <w:b/>
+          <w:bCs/>
+          <w:color w:val="FFFFFF"/>
+          <w:sz w:val="24"/>
+          <w:szCs w:val="24"/>
+          <w:lang w:val="pt-BR"/>
+        </w:rPr>
+        <w:spacing w:line="360" w:lineRule="auto" w:after="120"/>
         <w:jc w:val="both"/>
-        <w:spacing w:line="180" w:lineRule="auto" w:after="120"/>
-        <w:rPr>
-          <w:rFonts w:ascii="Arial" w:hAnsi="Arial" w:cs="Arial"/>
-        </w:rPr>
-      </w:pPr>
-      <w:r>
-        <w:rPr>
-          <w:rFonts w:ascii="Arial" w:hAnsi="Arial" w:cs="Arial"/>
-          <w:sz w:val="22"/>
-          <w:szCs w:val="22"/>
-          <w:lang w:val="pt-BR"/>
-        </w:rPr>
-        <w:t xml:space="preserve"/>
-      </w:r>
-    </w:p>
-    <w:p>
-      <w:pPr>
-        <w:pStyle w:val="TAMainText"/>
-        <w:jc w:val="both"/>
-        <w:spacing w:line="360" w:lineRule="auto" w:after="120"/>
-        <w:rPr>
-          <w:rFonts w:ascii="Arial" w:hAnsi="Arial" w:cs="Arial"/>
-        </w:rPr>
       </w:pPr>
       <w:r>
         <w:rPr>
@@ -2054,11 +2396,18 @@
     <w:p>
       <w:pPr>
         <w:pStyle w:val="TAMainText"/>
+        <w:ind w:left="85" w:right="130" w:firstLine="0"/>
+        <w:rPr>
+          <w:rFonts w:ascii="Arial" w:eastAsia="Arial" w:hAnsi="Arial" w:cs="Arial"/>
+          <w:b/>
+          <w:bCs/>
+          <w:color w:val="FFFFFF"/>
+          <w:sz w:val="24"/>
+          <w:szCs w:val="24"/>
+          <w:lang w:val="pt-BR"/>
+        </w:rPr>
+        <w:spacing w:line="360" w:lineRule="auto" w:after="120"/>
         <w:jc w:val="both"/>
-        <w:spacing w:line="360" w:lineRule="auto" w:after="120"/>
-        <w:rPr>
-          <w:rFonts w:ascii="Arial" w:hAnsi="Arial" w:cs="Arial"/>
-        </w:rPr>
       </w:pPr>
       <w:r>
         <w:rPr>
@@ -2073,11 +2422,18 @@
     <w:p>
       <w:pPr>
         <w:pStyle w:val="TAMainText"/>
+        <w:ind w:left="85" w:right="130" w:firstLine="0"/>
+        <w:rPr>
+          <w:rFonts w:ascii="Arial" w:eastAsia="Arial" w:hAnsi="Arial" w:cs="Arial"/>
+          <w:b/>
+          <w:bCs/>
+          <w:color w:val="FFFFFF"/>
+          <w:sz w:val="24"/>
+          <w:szCs w:val="24"/>
+          <w:lang w:val="pt-BR"/>
+        </w:rPr>
+        <w:spacing w:line="360" w:lineRule="auto" w:after="120"/>
         <w:jc w:val="both"/>
-        <w:spacing w:line="360" w:lineRule="auto" w:after="120"/>
-        <w:rPr>
-          <w:rFonts w:ascii="Arial" w:hAnsi="Arial" w:cs="Arial"/>
-        </w:rPr>
       </w:pPr>
       <w:r>
         <w:rPr>
@@ -2091,44 +2447,58 @@
     </w:p>
     <w:p>
       <w:pPr>
-        <w:pStyle w:val="TAMainText"/>
-        <w:jc w:val="both"/>
-        <w:spacing w:line="180" w:lineRule="auto" w:after="120"/>
+        <w:pStyle w:val="Absbox"/>
+        <w:pBdr>
+          <w:top w:val="single" w:sz="4" w:space="0" w:color="000000"/>
+          <w:left w:val="single" w:sz="4" w:space="4" w:color="000000"/>
+          <w:bottom w:val="single" w:sz="4" w:space="0" w:color="000000"/>
+          <w:right w:val="single" w:sz="4" w:space="4" w:color="000000"/>
+        </w:pBdr>
+        <w:shd w:val="clear" w:color="auto" w:fill="D9D9D9" w:themeFill="background1" w:themeFillShade="D9"/>
+        <w:spacing w:after="120"/>
+        <w:ind w:left="85"/>
+        <w:jc w:val="left"/>
         <w:rPr>
           <w:rFonts w:ascii="Arial" w:hAnsi="Arial" w:cs="Arial"/>
+          <w:color w:val="000000" w:themeColor="text1"/>
+          <w:sz w:val="24"/>
+          <w:szCs w:val="24"/>
+          <w:lang w:val="pt-BR"/>
         </w:rPr>
       </w:pPr>
       <w:r>
         <w:rPr>
           <w:rFonts w:ascii="Arial" w:hAnsi="Arial" w:cs="Arial"/>
-          <w:sz w:val="22"/>
-          <w:szCs w:val="22"/>
-          <w:lang w:val="pt-BR"/>
-        </w:rPr>
-        <w:t xml:space="preserve"/>
-      </w:r>
-    </w:p>
-    <w:p>
-      <w:pPr>
-        <w:pStyle w:val="Absbox"/>
-      </w:pPr>
-      <w:r>
-        <w:rPr>
-          <w:rFonts w:ascii="Arial"/>
-          <w:rFonts w:hAnsi="Arial"/>
-          <w:b/>
+          <w:color w:val="000000" w:themeColor="text1"/>
+          <w:sz w:val="24"/>
+          <w:szCs w:val="24"/>
+          <w:lang w:val="pt-BR"/>
         </w:rPr>
         <w:t>Conclusão</w:t>
       </w:r>
     </w:p>
     <w:p>
       <w:pPr>
+        <w:sectPr>
+          <w:type w:val="continuous"/>
+          <w:pgSz w:w="11906" w:h="16838"/>
+          <w:pgMar w:top="709" w:right="1134" w:bottom="1134" w:left="1134" w:header="0" w:footer="0" w:gutter="0"/>
+          <w:cols w:space="720"/>
+          <w:formProt w:val="0"/>
+          <w:docGrid w:linePitch="360" w:charSpace="8192"/>
+        </w:sectPr>
+      </w:pPr>
+    </w:p>
+    <w:p>
+      <w:pPr>
         <w:pStyle w:val="TAMainText"/>
+        <w:ind w:left="86" w:right="130" w:firstLine="0"/>
+        <w:rPr>
+          <w:rFonts w:ascii="Arial" w:hAnsi="Arial" w:cs="Arial"/>
+          <w:lang w:val="pt-BR"/>
+        </w:rPr>
+        <w:spacing w:line="360" w:lineRule="auto" w:after="120"/>
         <w:jc w:val="both"/>
-        <w:spacing w:line="360" w:lineRule="auto" w:after="120"/>
-        <w:rPr>
-          <w:rFonts w:ascii="Arial" w:hAnsi="Arial" w:cs="Arial"/>
-        </w:rPr>
       </w:pPr>
       <w:r>
         <w:rPr>
@@ -2142,44 +2512,58 @@
     </w:p>
     <w:p>
       <w:pPr>
-        <w:pStyle w:val="TAMainText"/>
-        <w:jc w:val="both"/>
-        <w:spacing w:line="180" w:lineRule="auto" w:after="120"/>
+        <w:pStyle w:val="Absbox"/>
+        <w:pBdr>
+          <w:top w:val="single" w:sz="4" w:space="0" w:color="000000"/>
+          <w:left w:val="single" w:sz="4" w:space="4" w:color="000000"/>
+          <w:bottom w:val="single" w:sz="4" w:space="0" w:color="000000"/>
+          <w:right w:val="single" w:sz="4" w:space="4" w:color="000000"/>
+        </w:pBdr>
+        <w:shd w:val="clear" w:color="auto" w:fill="D9D9D9" w:themeFill="background1" w:themeFillShade="D9"/>
+        <w:spacing w:after="120"/>
+        <w:ind w:left="85"/>
+        <w:jc w:val="left"/>
         <w:rPr>
           <w:rFonts w:ascii="Arial" w:hAnsi="Arial" w:cs="Arial"/>
+          <w:color w:val="000000" w:themeColor="text1"/>
+          <w:sz w:val="24"/>
+          <w:szCs w:val="24"/>
+          <w:lang w:val="pt-BR"/>
         </w:rPr>
       </w:pPr>
       <w:r>
         <w:rPr>
           <w:rFonts w:ascii="Arial" w:hAnsi="Arial" w:cs="Arial"/>
-          <w:sz w:val="22"/>
-          <w:szCs w:val="22"/>
-          <w:lang w:val="pt-BR"/>
-        </w:rPr>
-        <w:t xml:space="preserve"/>
-      </w:r>
-    </w:p>
-    <w:p>
-      <w:pPr>
-        <w:pStyle w:val="Absbox"/>
-      </w:pPr>
-      <w:r>
-        <w:rPr>
-          <w:rFonts w:ascii="Arial"/>
-          <w:rFonts w:hAnsi="Arial"/>
-          <w:b/>
+          <w:color w:val="000000" w:themeColor="text1"/>
+          <w:sz w:val="24"/>
+          <w:szCs w:val="24"/>
+          <w:lang w:val="pt-BR"/>
         </w:rPr>
         <w:t>Referências</w:t>
       </w:r>
     </w:p>
     <w:p>
       <w:pPr>
+        <w:sectPr>
+          <w:type w:val="continuous"/>
+          <w:pgSz w:w="11906" w:h="16838"/>
+          <w:pgMar w:top="709" w:right="1134" w:bottom="1134" w:left="1134" w:header="0" w:footer="0" w:gutter="0"/>
+          <w:cols w:space="720"/>
+          <w:formProt w:val="0"/>
+          <w:docGrid w:linePitch="360" w:charSpace="8192"/>
+        </w:sectPr>
+      </w:pPr>
+    </w:p>
+    <w:p>
+      <w:pPr>
         <w:pStyle w:val="TAMainText"/>
+        <w:ind w:left="86" w:right="130" w:firstLine="0"/>
+        <w:rPr>
+          <w:rFonts w:ascii="Arial" w:hAnsi="Arial" w:cs="Arial"/>
+          <w:lang w:val="pt-BR"/>
+        </w:rPr>
+        <w:spacing w:line="240" w:lineRule="auto" w:after="120"/>
         <w:jc w:val="both"/>
-        <w:spacing w:line="240" w:lineRule="auto" w:after="120"/>
-        <w:rPr>
-          <w:rFonts w:ascii="Arial" w:hAnsi="Arial" w:cs="Arial"/>
-        </w:rPr>
       </w:pPr>
       <w:r>
         <w:rPr>
@@ -2194,11 +2578,18 @@
     <w:p>
       <w:pPr>
         <w:pStyle w:val="TAMainText"/>
+        <w:ind w:left="85" w:right="130" w:firstLine="0"/>
+        <w:rPr>
+          <w:rFonts w:ascii="Arial" w:eastAsia="Arial" w:hAnsi="Arial" w:cs="Arial"/>
+          <w:b/>
+          <w:bCs/>
+          <w:color w:val="FFFFFF"/>
+          <w:sz w:val="24"/>
+          <w:szCs w:val="24"/>
+          <w:lang w:val="pt-BR"/>
+        </w:rPr>
+        <w:spacing w:line="240" w:lineRule="auto" w:after="120"/>
         <w:jc w:val="both"/>
-        <w:spacing w:line="240" w:lineRule="auto" w:after="120"/>
-        <w:rPr>
-          <w:rFonts w:ascii="Arial" w:hAnsi="Arial" w:cs="Arial"/>
-        </w:rPr>
       </w:pPr>
       <w:r>
         <w:rPr>
@@ -2213,11 +2604,18 @@
     <w:p>
       <w:pPr>
         <w:pStyle w:val="TAMainText"/>
+        <w:ind w:left="85" w:right="130" w:firstLine="0"/>
+        <w:rPr>
+          <w:rFonts w:ascii="Arial" w:eastAsia="Arial" w:hAnsi="Arial" w:cs="Arial"/>
+          <w:b/>
+          <w:bCs/>
+          <w:color w:val="FFFFFF"/>
+          <w:sz w:val="24"/>
+          <w:szCs w:val="24"/>
+          <w:lang w:val="pt-BR"/>
+        </w:rPr>
+        <w:spacing w:line="240" w:lineRule="auto" w:after="120"/>
         <w:jc w:val="both"/>
-        <w:spacing w:line="240" w:lineRule="auto" w:after="120"/>
-        <w:rPr>
-          <w:rFonts w:ascii="Arial" w:hAnsi="Arial" w:cs="Arial"/>
-        </w:rPr>
       </w:pPr>
       <w:r>
         <w:rPr>
@@ -2232,11 +2630,18 @@
     <w:p>
       <w:pPr>
         <w:pStyle w:val="TAMainText"/>
+        <w:ind w:left="85" w:right="130" w:firstLine="0"/>
+        <w:rPr>
+          <w:rFonts w:ascii="Arial" w:eastAsia="Arial" w:hAnsi="Arial" w:cs="Arial"/>
+          <w:b/>
+          <w:bCs/>
+          <w:color w:val="FFFFFF"/>
+          <w:sz w:val="24"/>
+          <w:szCs w:val="24"/>
+          <w:lang w:val="pt-BR"/>
+        </w:rPr>
+        <w:spacing w:line="240" w:lineRule="auto" w:after="120"/>
         <w:jc w:val="both"/>
-        <w:spacing w:line="240" w:lineRule="auto" w:after="120"/>
-        <w:rPr>
-          <w:rFonts w:ascii="Arial" w:hAnsi="Arial" w:cs="Arial"/>
-        </w:rPr>
       </w:pPr>
       <w:r>
         <w:rPr>
@@ -2250,44 +2655,75 @@
     </w:p>
     <w:p>
       <w:pPr>
-        <w:pStyle w:val="TAMainText"/>
-        <w:jc w:val="both"/>
-        <w:spacing w:line="180" w:lineRule="auto" w:after="120"/>
-        <w:rPr>
-          <w:rFonts w:ascii="Arial" w:hAnsi="Arial" w:cs="Arial"/>
-        </w:rPr>
-      </w:pPr>
-      <w:r>
-        <w:rPr>
-          <w:rFonts w:ascii="Arial" w:hAnsi="Arial" w:cs="Arial"/>
-          <w:sz w:val="22"/>
-          <w:szCs w:val="22"/>
-          <w:lang w:val="pt-BR"/>
-        </w:rPr>
-        <w:t xml:space="preserve"/>
-      </w:r>
+        <w:sectPr>
+          <w:type w:val="continuous"/>
+          <w:pgSz w:w="11906" w:h="16838"/>
+          <w:pgMar w:top="709" w:right="1134" w:bottom="1134" w:left="1134" w:header="0" w:footer="0" w:gutter="0"/>
+          <w:cols w:space="720"/>
+          <w:formProt w:val="0"/>
+          <w:docGrid w:linePitch="360" w:charSpace="8192"/>
+        </w:sectPr>
+      </w:pPr>
     </w:p>
     <w:p>
       <w:pPr>
         <w:pStyle w:val="Absbox"/>
+        <w:pBdr>
+          <w:top w:val="single" w:sz="4" w:space="0" w:color="000000"/>
+          <w:left w:val="single" w:sz="4" w:space="4" w:color="000000"/>
+          <w:bottom w:val="single" w:sz="4" w:space="0" w:color="000000"/>
+          <w:right w:val="single" w:sz="4" w:space="4" w:color="000000"/>
+        </w:pBdr>
+        <w:shd w:val="clear" w:color="auto" w:fill="D9D9D9" w:themeFill="background1" w:themeFillShade="D9"/>
+        <w:spacing w:after="120"/>
+        <w:ind w:left="85"/>
+        <w:jc w:val="left"/>
+        <w:rPr>
+          <w:rFonts w:ascii="Arial" w:hAnsi="Arial" w:cs="Arial"/>
+          <w:color w:val="000000" w:themeColor="text1"/>
+          <w:sz w:val="24"/>
+          <w:szCs w:val="24"/>
+          <w:lang w:val="pt-BR"/>
+        </w:rPr>
       </w:pPr>
       <w:r>
         <w:rPr>
-          <w:rFonts w:ascii="Arial"/>
-          <w:rFonts w:hAnsi="Arial"/>
-          <w:b/>
+          <w:rFonts w:ascii="Arial" w:hAnsi="Arial" w:cs="Arial"/>
+          <w:color w:val="000000" w:themeColor="text1"/>
+          <w:sz w:val="24"/>
+          <w:szCs w:val="24"/>
+          <w:lang w:val="pt-BR"/>
         </w:rPr>
         <w:t>Anexos – Códigos das Implementações</w:t>
       </w:r>
     </w:p>
     <w:p>
       <w:pPr>
+        <w:sectPr>
+          <w:type w:val="continuous"/>
+          <w:pgSz w:w="11906" w:h="16838"/>
+          <w:pgMar w:top="709" w:right="1134" w:bottom="1134" w:left="1134" w:header="0" w:footer="0" w:gutter="0"/>
+          <w:cols w:space="720"/>
+          <w:formProt w:val="0"/>
+          <w:docGrid w:linePitch="360" w:charSpace="8192"/>
+        </w:sectPr>
+      </w:pPr>
+    </w:p>
+    <w:p>
+      <w:pPr>
         <w:pStyle w:val="TAMainText"/>
+        <w:ind w:left="85" w:right="130" w:firstLine="0"/>
+        <w:rPr>
+          <w:rFonts w:ascii="Arial" w:eastAsia="Arial" w:hAnsi="Arial" w:cs="Arial"/>
+          <w:b/>
+          <w:bCs/>
+          <w:color w:val="FFFFFF"/>
+          <w:sz w:val="24"/>
+          <w:szCs w:val="24"/>
+          <w:lang w:val="pt-BR"/>
+        </w:rPr>
+        <w:spacing w:line="360" w:lineRule="auto" w:after="120"/>
         <w:jc w:val="both"/>
-        <w:spacing w:line="360" w:lineRule="auto" w:after="120"/>
-        <w:rPr>
-          <w:rFonts w:ascii="Arial" w:hAnsi="Arial" w:cs="Arial"/>
-        </w:rPr>
       </w:pPr>
       <w:r>
         <w:rPr>
@@ -2296,9 +2732,11 @@
           <w:szCs w:val="22"/>
           <w:lang w:val="pt-BR"/>
         </w:rPr>
-        <w:t xml:space="preserve">O código-fonte integral do projeto, os scripts facilitadores de compilação e os conjuntos completos de dados gerados em formato CSV encontram-se disponíveis no repositório GitHub:
-Repositório GitHub: [Inserir o link do seu GitHub aqui]
-Instruções para execução: Execute o script 'executar_gui.bat' no Windows para inicializar a interface gráfica Swing, ou execute 'executar_cli.bat' para reproduzir as medições diretamente via terminal.</w:t>
+        <w:t xml:space="preserve">O código-fonte integral do projeto, os scripts facilitadores de compilação, a interface gráfica Swing e os conjuntos completos de dados gerados em formato CSV encontram-se disponíveis no repositório GitHub:
+Repositório GitHub: https://github.com/andersoncataldo/algoritmos-desempenho-paralelo-concorrente.git
+Instruções para execução:
+1. Execute o script 'executar_gui.bat' no Windows para inicializar a interface gráfica Swing com gráficos dinâmicos;
+2. Ou execute 'executar_cli.bat' para reproduzir os benchmarks diretamente via terminal headless.</w:t>
       </w:r>
     </w:p>
     <w:sectPr>

</xml_diff>